<commit_message>
docs: continue work on protocol reconstruction
</commit_message>
<xml_diff>
--- a/docs/protocol/reconstruction/Protokollrekonstruktion.docx
+++ b/docs/protocol/reconstruction/Protokollrekonstruktion.docx
@@ -8,167 +8,6 @@
       </w:pPr>
       <w:r>
         <w:t>Protokollrekonstruktion</w:t>
-      </w:r>
-    </w:p>
-    <w:p>
-      <w:pPr>
-        <w:pStyle w:val="berschrift1"/>
-      </w:pPr>
-      <w:r>
-        <w:t>Allgemeines</w:t>
-      </w:r>
-    </w:p>
-    <w:p>
-      <w:pPr>
-        <w:pStyle w:val="Listenabsatz"/>
-        <w:numPr>
-          <w:ilvl w:val="0"/>
-          <w:numId w:val="2"/>
-        </w:numPr>
-        <w:ind w:left="357" w:hanging="357"/>
-        <w:contextualSpacing w:val="0"/>
-        <w:jc w:val="both"/>
-      </w:pPr>
-      <w:r>
-        <w:t>Das Gerät wird beim Start der App erkannt und initialisiert. Default wird es dabei in den Betriebsmodus Absorbanz und in den Datenerfassungsmodus Vollspektrum gesetzt.</w:t>
-      </w:r>
-    </w:p>
-    <w:p>
-      <w:pPr>
-        <w:pStyle w:val="Listenabsatz"/>
-        <w:numPr>
-          <w:ilvl w:val="0"/>
-          <w:numId w:val="2"/>
-        </w:numPr>
-        <w:ind w:left="357" w:hanging="357"/>
-        <w:contextualSpacing w:val="0"/>
-        <w:jc w:val="both"/>
-      </w:pPr>
-      <w:r>
-        <w:t xml:space="preserve">Das Gerät kennt die Betriebsmodi Absorbanz, Transmission, Intensität, Fluoreszenz 405 </w:t>
-      </w:r>
-      <w:proofErr w:type="spellStart"/>
-      <w:r>
-        <w:t>nm</w:t>
-      </w:r>
-      <w:proofErr w:type="spellEnd"/>
-      <w:r>
-        <w:t xml:space="preserve">, Fluoreszenz 500 </w:t>
-      </w:r>
-      <w:proofErr w:type="spellStart"/>
-      <w:r>
-        <w:t>nm</w:t>
-      </w:r>
-      <w:proofErr w:type="spellEnd"/>
-      <w:r>
-        <w:t xml:space="preserve"> und Erfassung von Rohdaten.</w:t>
-      </w:r>
-    </w:p>
-    <w:p>
-      <w:pPr>
-        <w:pStyle w:val="Listenabsatz"/>
-        <w:numPr>
-          <w:ilvl w:val="0"/>
-          <w:numId w:val="2"/>
-        </w:numPr>
-        <w:ind w:left="357" w:hanging="357"/>
-        <w:contextualSpacing w:val="0"/>
-        <w:jc w:val="both"/>
-      </w:pPr>
-      <w:r>
-        <w:t>Das Gerät kennt die Datenerfassungsmodi Vollspektrum, zeitgesteuert und ereignisgesteuert.</w:t>
-      </w:r>
-    </w:p>
-    <w:p>
-      <w:pPr>
-        <w:pStyle w:val="Listenabsatz"/>
-        <w:numPr>
-          <w:ilvl w:val="0"/>
-          <w:numId w:val="2"/>
-        </w:numPr>
-        <w:ind w:left="357" w:hanging="357"/>
-        <w:contextualSpacing w:val="0"/>
-        <w:jc w:val="both"/>
-      </w:pPr>
-      <w:r>
-        <w:t>In den Betriebsmodi Absorbanz und Transmission muss das Gerät kalibriert werden, bevor eine Messung gestartet werden kann.</w:t>
-      </w:r>
-    </w:p>
-    <w:p>
-      <w:pPr>
-        <w:pStyle w:val="Listenabsatz"/>
-        <w:numPr>
-          <w:ilvl w:val="0"/>
-          <w:numId w:val="2"/>
-        </w:numPr>
-        <w:ind w:left="357" w:hanging="357"/>
-        <w:contextualSpacing w:val="0"/>
-        <w:jc w:val="both"/>
-      </w:pPr>
-      <w:r>
-        <w:t>Ein Wechsel zwischen den Betriebsmodi und Datenerfassungsmodi ist sowohl direkt nach der Initialisierung als auch nach einer erfolgten Kalibration des Geräts möglich.</w:t>
-      </w:r>
-    </w:p>
-    <w:p>
-      <w:pPr>
-        <w:pStyle w:val="Listenabsatz"/>
-        <w:numPr>
-          <w:ilvl w:val="0"/>
-          <w:numId w:val="2"/>
-        </w:numPr>
-        <w:ind w:left="357" w:hanging="357"/>
-        <w:contextualSpacing w:val="0"/>
-        <w:jc w:val="both"/>
-      </w:pPr>
-      <w:r>
-        <w:t>Der Betriebsmodus kann aus jedem Datenerfassungsmodus heraus gewechselt werden, der Datenerfassungsmodus bleibt dabei erhalten.</w:t>
-      </w:r>
-    </w:p>
-    <w:p>
-      <w:pPr>
-        <w:pStyle w:val="Listenabsatz"/>
-        <w:numPr>
-          <w:ilvl w:val="0"/>
-          <w:numId w:val="2"/>
-        </w:numPr>
-        <w:ind w:left="357" w:hanging="357"/>
-        <w:contextualSpacing w:val="0"/>
-        <w:jc w:val="both"/>
-      </w:pPr>
-      <w:r>
-        <w:t xml:space="preserve">Die App schickt zur Kommunikation mit dem Geräte Pakete mit einer Länge von 64 Bytes. Die Speicherarchitektur des Geräts ist </w:t>
-      </w:r>
-      <w:proofErr w:type="spellStart"/>
-      <w:r>
-        <w:t>little</w:t>
-      </w:r>
-      <w:proofErr w:type="spellEnd"/>
-      <w:r>
-        <w:t xml:space="preserve"> </w:t>
-      </w:r>
-      <w:proofErr w:type="spellStart"/>
-      <w:r>
-        <w:t>endian</w:t>
-      </w:r>
-      <w:proofErr w:type="spellEnd"/>
-      <w:r>
-        <w:t xml:space="preserve">. Das niederwertigste Byte codiert jeweils eine Art </w:t>
-      </w:r>
-      <w:proofErr w:type="spellStart"/>
-      <w:r>
-        <w:t>Opcode</w:t>
-      </w:r>
-      <w:proofErr w:type="spellEnd"/>
-      <w:r>
-        <w:t xml:space="preserve">. Es gibt eine begrenzte Anzahl von </w:t>
-      </w:r>
-      <w:proofErr w:type="spellStart"/>
-      <w:r>
-        <w:t>Opcodes</w:t>
-      </w:r>
-      <w:proofErr w:type="spellEnd"/>
-      <w:r>
-        <w:t>, die sich eindeutig verschiedenen Zustandswechseln zuordnen lassen.</w:t>
       </w:r>
     </w:p>
     <w:p>
@@ -197,8 +36,22 @@
       </w:r>
     </w:p>
     <w:p>
+      <w:pPr>
+        <w:rPr>
+          <w:rStyle w:val="Fett"/>
+        </w:rPr>
+      </w:pPr>
       <w:r>
+        <w:rPr>
+          <w:rStyle w:val="Fett"/>
+        </w:rPr>
         <w:t>Paket Nr. 1:</w:t>
+      </w:r>
+      <w:r>
+        <w:rPr>
+          <w:rStyle w:val="Fett"/>
+        </w:rPr>
+        <w:t xml:space="preserve"> Keine IN-Pakete</w:t>
       </w:r>
     </w:p>
     <w:tbl>
@@ -925,11 +778,9 @@
             <w:tcW w:w="480" w:type="dxa"/>
           </w:tcPr>
           <w:p>
-            <w:proofErr w:type="spellStart"/>
             <w:r>
               <w:t>fc</w:t>
             </w:r>
-            <w:proofErr w:type="spellEnd"/>
           </w:p>
         </w:tc>
         <w:tc>
@@ -1025,7 +876,7 @@
         <w:tc>
           <w:tcPr>
             <w:tcW w:w="481" w:type="dxa"/>
-            <w:shd w:val="clear" w:color="auto" w:fill="196B24" w:themeFill="accent3"/>
+            <w:shd w:val="clear" w:color="auto" w:fill="EE0000"/>
           </w:tcPr>
           <w:p>
             <w:r>
@@ -1036,7 +887,7 @@
         <w:tc>
           <w:tcPr>
             <w:tcW w:w="481" w:type="dxa"/>
-            <w:shd w:val="clear" w:color="auto" w:fill="196B24" w:themeFill="accent3"/>
+            <w:shd w:val="clear" w:color="auto" w:fill="EE0000"/>
           </w:tcPr>
           <w:p>
             <w:r>
@@ -1059,11 +910,9 @@
             <w:tcW w:w="481" w:type="dxa"/>
           </w:tcPr>
           <w:p>
-            <w:proofErr w:type="spellStart"/>
             <w:r>
               <w:t>db</w:t>
             </w:r>
-            <w:proofErr w:type="spellEnd"/>
           </w:p>
         </w:tc>
         <w:tc>
@@ -1109,7 +958,7 @@
         <w:tc>
           <w:tcPr>
             <w:tcW w:w="481" w:type="dxa"/>
-            <w:shd w:val="clear" w:color="auto" w:fill="FFFF00"/>
+            <w:shd w:val="clear" w:color="auto" w:fill="501549" w:themeFill="accent5" w:themeFillShade="80"/>
           </w:tcPr>
           <w:p>
             <w:r>
@@ -1190,7 +1039,7 @@
         <w:tc>
           <w:tcPr>
             <w:tcW w:w="481" w:type="dxa"/>
-            <w:shd w:val="clear" w:color="auto" w:fill="FFFF00"/>
+            <w:shd w:val="clear" w:color="auto" w:fill="501549" w:themeFill="accent5" w:themeFillShade="80"/>
           </w:tcPr>
           <w:p>
             <w:r>
@@ -1995,10 +1844,11 @@
         <w:tc>
           <w:tcPr>
             <w:tcW w:w="481" w:type="dxa"/>
-          </w:tcPr>
-          <w:p>
-            <w:r>
-              <w:t>e3</w:t>
+            <w:shd w:val="clear" w:color="auto" w:fill="3A3A3A" w:themeFill="background2" w:themeFillShade="40"/>
+          </w:tcPr>
+          <w:p>
+            <w:r>
+              <w:t>xx</w:t>
             </w:r>
           </w:p>
         </w:tc>
@@ -2067,11 +1917,9 @@
             <w:tcW w:w="481" w:type="dxa"/>
           </w:tcPr>
           <w:p>
-            <w:proofErr w:type="spellStart"/>
             <w:r>
               <w:t>db</w:t>
             </w:r>
-            <w:proofErr w:type="spellEnd"/>
           </w:p>
         </w:tc>
         <w:tc>
@@ -2099,11 +1947,9 @@
             <w:tcW w:w="481" w:type="dxa"/>
           </w:tcPr>
           <w:p>
-            <w:proofErr w:type="spellStart"/>
             <w:r>
               <w:t>ae</w:t>
             </w:r>
-            <w:proofErr w:type="spellEnd"/>
           </w:p>
         </w:tc>
         <w:tc>
@@ -2119,7 +1965,7 @@
         <w:tc>
           <w:tcPr>
             <w:tcW w:w="481" w:type="dxa"/>
-            <w:shd w:val="clear" w:color="auto" w:fill="FF00FF"/>
+            <w:shd w:val="clear" w:color="auto" w:fill="002060"/>
           </w:tcPr>
           <w:p>
             <w:r>
@@ -2191,15 +2037,13 @@
     </w:tbl>
     <w:p>
       <w:pPr>
+        <w:pStyle w:val="Listenabsatz"/>
+        <w:numPr>
+          <w:ilvl w:val="0"/>
+          <w:numId w:val="3"/>
+        </w:numPr>
         <w:spacing w:before="120"/>
-      </w:pPr>
-      <w:r>
-        <w:t>Keine IN-Pakete</w:t>
-      </w:r>
-    </w:p>
-    <w:p>
-      <w:pPr>
-        <w:spacing w:before="120"/>
+        <w:ind w:left="357" w:hanging="357"/>
         <w:jc w:val="both"/>
       </w:pPr>
       <w:r>
@@ -2211,18 +2055,28 @@
       </w:r>
       <w:proofErr w:type="gramEnd"/>
       <w:r>
-        <w:t xml:space="preserve"> während vom Öffnen bis zum Schliessen der App konstant mit der Kalibration und </w:t>
-      </w:r>
-      <w:proofErr w:type="spellStart"/>
-      <w:r>
-        <w:t>Rekalibration</w:t>
-      </w:r>
-      <w:proofErr w:type="spellEnd"/>
-      <w:r>
-        <w:t xml:space="preserve"> des Geräts assoziiert bleibt.</w:t>
+        <w:t xml:space="preserve"> während vom Öffnen bis zum Schliessen der App konstant mit der Kalibration und Rekalibration des Geräts assoziiert bleibt.</w:t>
       </w:r>
       <w:r>
-        <w:t xml:space="preserve"> Byte Nr. 22 und 30 sind identisch und bleiben während mehrerer Sessions </w:t>
+        <w:t xml:space="preserve"> Die Werte sind identisch mit Byte Nr. 26 und 27 in Paket Nr. 6, Byte Nr. 18 und 19 der Pakete 7 – 17 und 19 – 28, sowie Byte Nr. 26 und 27 in Paket Nr. 18. Die Werte werden infolge in alle 40er Pakete vom gleichen Typ wie Paket Nr. </w:t>
+      </w:r>
+      <w:r>
+        <w:t>7 – 17 bzw. 19 – 28, sofern diese Pakete mit der Kalibration assoziiert sind, in die Positionen 18 und 19 kopiert. Weiterhin werden die Werte an die Positionen 26 und 27 von einem Typus 04er Pakete, die mit der Kalibration des Gerätes assoziiert sind, sowie an die Positionen 18 und 19 aller a0er Pakete (werden nur während der Kalibration geschickt) kopiert.</w:t>
+      </w:r>
+    </w:p>
+    <w:p>
+      <w:pPr>
+        <w:pStyle w:val="Listenabsatz"/>
+        <w:numPr>
+          <w:ilvl w:val="0"/>
+          <w:numId w:val="3"/>
+        </w:numPr>
+        <w:spacing w:before="120"/>
+        <w:ind w:left="357" w:hanging="357"/>
+        <w:jc w:val="both"/>
+      </w:pPr>
+      <w:r>
+        <w:t xml:space="preserve">Byte Nr. 22 und 30 sind identisch und bleiben während mehrerer Sessions </w:t>
       </w:r>
       <w:r>
         <w:t>konstant,</w:t>
@@ -2231,13 +2085,88 @@
         <w:t xml:space="preserve"> solange das Gerät nicht neu verbunden wird.</w:t>
       </w:r>
       <w:r>
-        <w:t xml:space="preserve"> Auch Byte Nr. 82</w:t>
+        <w:t xml:space="preserve"> Die Werte sind identisch mit Byte Nr. 30 in Paketen Nr. 6 und Nr. 17.</w:t>
+      </w:r>
+      <w:r>
+        <w:t xml:space="preserve"> Auch Byte Nr. </w:t>
+      </w:r>
+      <w:r>
+        <w:t>58</w:t>
+      </w:r>
+      <w:r>
+        <w:t xml:space="preserve"> ändert sich nicht, solange das Gerät nicht neu verbunden wird. </w:t>
+      </w:r>
+      <w:r>
+        <w:t>D</w:t>
+      </w:r>
+      <w:r>
+        <w:t>er Wert ist</w:t>
+      </w:r>
+      <w:r>
+        <w:t xml:space="preserve"> identisch mit </w:t>
+      </w:r>
+      <w:r>
+        <w:t>Nr. 18 und Nr. 38 in Paket</w:t>
+      </w:r>
+      <w:r>
+        <w:t>en</w:t>
+      </w:r>
+      <w:r>
+        <w:t xml:space="preserve"> Nr. 6 </w:t>
+      </w:r>
+      <w:r>
+        <w:t>und Nr. 17. Byte Nr. 22, 30 und 58 sind nur für die Initialisierung relevant.</w:t>
+      </w:r>
+      <w:r>
+        <w:t xml:space="preserve"> Byte Nr. 46 ändert sich ebenfalls nur mit einer Neuverbindung des Geräts, wird aber in keinen anderen Paketen wieder kopiert.</w:t>
       </w:r>
     </w:p>
-    <w:p/>
     <w:p>
+      <w:pPr>
+        <w:pStyle w:val="Listenabsatz"/>
+        <w:numPr>
+          <w:ilvl w:val="0"/>
+          <w:numId w:val="3"/>
+        </w:numPr>
+        <w:spacing w:before="120"/>
+        <w:ind w:left="357" w:hanging="357"/>
+        <w:jc w:val="both"/>
+      </w:pPr>
       <w:r>
+        <w:t>Bytes Nr. 12 und 13 ändern sich von einer Session zur nächsten und werden in keine anderen Pakete kopiert.</w:t>
+      </w:r>
+    </w:p>
+    <w:p>
+      <w:pPr>
+        <w:rPr>
+          <w:rStyle w:val="Fett"/>
+        </w:rPr>
+      </w:pPr>
+      <w:r>
+        <w:rPr>
+          <w:rStyle w:val="Fett"/>
+        </w:rPr>
+        <w:br w:type="page"/>
+      </w:r>
+    </w:p>
+    <w:p>
+      <w:pPr>
+        <w:rPr>
+          <w:rStyle w:val="Fett"/>
+        </w:rPr>
+      </w:pPr>
+      <w:r>
+        <w:rPr>
+          <w:rStyle w:val="Fett"/>
+        </w:rPr>
+        <w:lastRenderedPageBreak/>
         <w:t>Paket Nr. 2:</w:t>
+      </w:r>
+      <w:r>
+        <w:rPr>
+          <w:rStyle w:val="Fett"/>
+        </w:rPr>
+        <w:t xml:space="preserve"> Keine IN-Pakete</w:t>
       </w:r>
     </w:p>
     <w:tbl>
@@ -3022,10 +2951,11 @@
         <w:tc>
           <w:tcPr>
             <w:tcW w:w="481" w:type="dxa"/>
-          </w:tcPr>
-          <w:p>
-            <w:r>
-              <w:t>49</w:t>
+            <w:shd w:val="clear" w:color="auto" w:fill="92D050"/>
+          </w:tcPr>
+          <w:p>
+            <w:r>
+              <w:t>xx</w:t>
             </w:r>
           </w:p>
         </w:tc>
@@ -3928,20 +3858,25 @@
         <w:tc>
           <w:tcPr>
             <w:tcW w:w="480" w:type="dxa"/>
-          </w:tcPr>
-          <w:p>
-            <w:r>
-              <w:t>c7</w:t>
-            </w:r>
-          </w:p>
-        </w:tc>
-        <w:tc>
-          <w:tcPr>
-            <w:tcW w:w="481" w:type="dxa"/>
-          </w:tcPr>
-          <w:p>
-            <w:r>
-              <w:t>4d</w:t>
+            <w:shd w:val="clear" w:color="auto" w:fill="0C3512" w:themeFill="accent3" w:themeFillShade="80"/>
+          </w:tcPr>
+          <w:p>
+            <w:r>
+              <w:t>xx</w:t>
+            </w:r>
+          </w:p>
+        </w:tc>
+        <w:tc>
+          <w:tcPr>
+            <w:tcW w:w="481" w:type="dxa"/>
+            <w:shd w:val="clear" w:color="auto" w:fill="0C3512" w:themeFill="accent3" w:themeFillShade="80"/>
+          </w:tcPr>
+          <w:p>
+            <w:r>
+              <w:t>x</w:t>
+            </w:r>
+            <w:r>
+              <w:t>x</w:t>
             </w:r>
           </w:p>
         </w:tc>
@@ -3980,11 +3915,9 @@
             <w:tcW w:w="481" w:type="dxa"/>
           </w:tcPr>
           <w:p>
-            <w:proofErr w:type="spellStart"/>
             <w:r>
               <w:t>db</w:t>
             </w:r>
-            <w:proofErr w:type="spellEnd"/>
           </w:p>
         </w:tc>
         <w:tc>
@@ -4070,10 +4003,11 @@
         <w:tc>
           <w:tcPr>
             <w:tcW w:w="481" w:type="dxa"/>
-          </w:tcPr>
-          <w:p>
-            <w:r>
-              <w:t>4f</w:t>
+            <w:shd w:val="clear" w:color="auto" w:fill="FFFF00"/>
+          </w:tcPr>
+          <w:p>
+            <w:r>
+              <w:t>xx</w:t>
             </w:r>
           </w:p>
         </w:tc>
@@ -4224,17 +4158,28 @@
     <w:p>
       <w:pPr>
         <w:spacing w:before="120"/>
+        <w:jc w:val="both"/>
       </w:pPr>
-      <w:r>
-        <w:t>Keine IN-Pakete</w:t>
-      </w:r>
     </w:p>
     <w:p>
       <w:pPr>
+        <w:pStyle w:val="Listenabsatz"/>
+        <w:numPr>
+          <w:ilvl w:val="0"/>
+          <w:numId w:val="4"/>
+        </w:numPr>
         <w:spacing w:before="120"/>
+        <w:ind w:left="357" w:hanging="357"/>
+        <w:jc w:val="both"/>
       </w:pPr>
       <w:r>
-        <w:t>Byte Nr.</w:t>
+        <w:t>Byte</w:t>
+      </w:r>
+      <w:r>
+        <w:t>s</w:t>
+      </w:r>
+      <w:r>
+        <w:t xml:space="preserve"> Nr.</w:t>
       </w:r>
       <w:r>
         <w:t xml:space="preserve"> 18 und 19 sowie</w:t>
@@ -4252,12 +4197,193 @@
         <w:t>en</w:t>
       </w:r>
       <w:r>
-        <w:t>.</w:t>
+        <w:t>:</w:t>
+      </w:r>
+      <w:r>
+        <w:t xml:space="preserve"> </w:t>
       </w:r>
     </w:p>
     <w:p>
+      <w:pPr>
+        <w:pStyle w:val="Listenabsatz"/>
+        <w:numPr>
+          <w:ilvl w:val="1"/>
+          <w:numId w:val="4"/>
+        </w:numPr>
+        <w:spacing w:before="120"/>
+        <w:jc w:val="both"/>
+      </w:pPr>
       <w:r>
+        <w:t>Die Werte von Byte Nr. 18 und 19 sind identisch mit Byte Nr. 58 und 59 in Paket Nr. 3, Byte Nr. 42 und 43 in Paket Nr. 5, sowie Byte Nr. 58 und 59 in Paket Nr. 29.</w:t>
+      </w:r>
+      <w:r>
+        <w:t xml:space="preserve"> Sie werden infolge in allen 41er Paketen vom gleichen Typ wie Paket Nr. 29 an den Positionen 58 und 59, sowie in allen 04er Paketen vom gleichen Typ wie Paket Nr. 5 an den Positionen 42 und 43 kopiert.</w:t>
+      </w:r>
+      <w:r>
+        <w:t xml:space="preserve"> Weiterhin werden die Werte an die Positionen 50 und 51 von einem anderen Typus 04er Pakete, die mit der Kalibration des Gerätes assoziiert sind, kopiert.</w:t>
+      </w:r>
+    </w:p>
+    <w:p>
+      <w:pPr>
+        <w:pStyle w:val="Listenabsatz"/>
+        <w:numPr>
+          <w:ilvl w:val="1"/>
+          <w:numId w:val="4"/>
+        </w:numPr>
+        <w:spacing w:before="120"/>
+        <w:jc w:val="both"/>
+      </w:pPr>
+      <w:r>
+        <w:t>Die Werte von Byte Nr. 58 und 59 sind identisch mit Byte Nr. 6 und 7 und Byte Nr. 18 und 19 in Paket Nr. 4 sowie Byte Nr. 62 und 63 in Paket Nr. 5. Sie werden infolge in alle 40er Pakete vom gleichen Typ wie Paket Nr. 7 an die Positionen 10 und 11 sowie 62 und 63,</w:t>
+      </w:r>
+      <w:r>
+        <w:t xml:space="preserve"> in alle 40er Pakete vom gleichen Typ wie Nr. 33 an die Positionen 38 und 39, sowie</w:t>
+      </w:r>
+      <w:r>
+        <w:t xml:space="preserve"> in alle 41er Pakete vom gleichen Typ wie Paket Nr. </w:t>
+      </w:r>
+      <w:r>
+        <w:t>29 an die Positionen 38 und 39 kopiert.</w:t>
+      </w:r>
+      <w:r>
+        <w:t xml:space="preserve"> Weiterhin werden die Werte an die Positionen 26 und 27 der 04er Pakete, die mit der Kalibration assoziiert sind und and den Positionen 50 und 51 die Werte aus Byte Nr. 18 und 19 enthalten, kopiert.</w:t>
+      </w:r>
+    </w:p>
+    <w:p>
+      <w:pPr>
+        <w:pStyle w:val="Listenabsatz"/>
+        <w:numPr>
+          <w:ilvl w:val="0"/>
+          <w:numId w:val="4"/>
+        </w:numPr>
+        <w:spacing w:before="120"/>
+        <w:ind w:left="357" w:hanging="357"/>
+        <w:jc w:val="both"/>
+      </w:pPr>
+      <w:r>
+        <w:t>Byte Nr. 10 ändert sich nicht, solange das Gerät nicht neu verbunden wird. Der</w:t>
+      </w:r>
+      <w:r>
+        <w:t xml:space="preserve"> Wert</w:t>
+      </w:r>
+      <w:r>
+        <w:t xml:space="preserve"> ist identisch mit Byte Nr. 50 in Paket Nr. 3, Nr. 62 in Paket Nr. 4, </w:t>
+      </w:r>
+      <w:r>
+        <w:t>Nr. 34 in Paket Nr. 5, Nr. 50 in Paket Nr. 29, Nr. 22 in Paket Nr. 32 und wird infolge in allen 41er Paketen kopiert. Sind diese in der Form von Paket Nr. 29, dann ist der Wert an Position Nr. 50 identisch, sind es 41er Pakete wie Nr. 32, dann ist der Wert an Position Nr. 22 identisch.</w:t>
+      </w:r>
+    </w:p>
+    <w:p>
+      <w:pPr>
+        <w:pStyle w:val="Listenabsatz"/>
+        <w:numPr>
+          <w:ilvl w:val="0"/>
+          <w:numId w:val="4"/>
+        </w:numPr>
+        <w:spacing w:before="120"/>
+        <w:ind w:left="357" w:hanging="357"/>
+        <w:jc w:val="both"/>
+      </w:pPr>
+      <w:r>
+        <w:t>Byte Nr. 50 ändert sich nicht, solange das Gerät nicht neu verbunden wird. Der Wert ist identisch mit Byte Nr. 10 in Paket Nr. 4 und wird infolge in alle 40er Pakete vom gleichen Typ wie Paket Nr. 33 an die Position 10 kopiert.</w:t>
+      </w:r>
+    </w:p>
+    <w:p>
+      <w:pPr>
+        <w:pStyle w:val="Listenabsatz"/>
+        <w:numPr>
+          <w:ilvl w:val="0"/>
+          <w:numId w:val="4"/>
+        </w:numPr>
+        <w:spacing w:before="120"/>
+        <w:ind w:left="357" w:hanging="357"/>
+        <w:jc w:val="both"/>
+      </w:pPr>
+      <w:r>
+        <w:t>Byte</w:t>
+      </w:r>
+      <w:r>
+        <w:t>s</w:t>
+      </w:r>
+      <w:r>
+        <w:t xml:space="preserve"> Nr. 36 und 37 ändern sich nicht, solange das Gerät nicht neu verbunden wird, die Werte werden in keine anderen Pakete kopiert.</w:t>
+      </w:r>
+    </w:p>
+    <w:p>
+      <w:pPr>
+        <w:pStyle w:val="Listenabsatz"/>
+        <w:numPr>
+          <w:ilvl w:val="0"/>
+          <w:numId w:val="4"/>
+        </w:numPr>
+        <w:spacing w:before="120"/>
+        <w:ind w:left="357" w:hanging="357"/>
+        <w:jc w:val="both"/>
+      </w:pPr>
+      <w:r>
+        <w:t>Bytes Nr. 16 und 17 ändern sich von einer Session zur nächsten und werden an die Positionen 56 und 57 von Paket Nr. 3 kopiert.</w:t>
+      </w:r>
+    </w:p>
+    <w:p>
+      <w:pPr>
+        <w:pStyle w:val="Listenabsatz"/>
+        <w:numPr>
+          <w:ilvl w:val="0"/>
+          <w:numId w:val="4"/>
+        </w:numPr>
+        <w:spacing w:before="120"/>
+        <w:ind w:left="357" w:hanging="357"/>
+        <w:jc w:val="both"/>
+      </w:pPr>
+      <w:r>
+        <w:t xml:space="preserve">Bytes Nr. 54 und 55 ändern sich von einer Session zur nächsten und werden an die Positionen 10 und 11 sowie 22 und 23 von Paket Nr. 6 und Nr. 18 kopiert. Die Werte werden auch an die Positionen 26 und 27 sowie 30 und 31 von Paket Nr. 29 kopiert. </w:t>
+      </w:r>
+      <w:r>
+        <w:t>Infolge tauchen die gleichen Werte wieder in 41er Paketen vom gleichen Typus</w:t>
+      </w:r>
+      <w:r>
+        <w:t xml:space="preserve"> wie Paket Nr. 29</w:t>
+      </w:r>
+      <w:r>
+        <w:t xml:space="preserve"> an den Positionen</w:t>
+      </w:r>
+      <w:r>
+        <w:t xml:space="preserve"> 26 und 27 sowie 30 und 31 auf, allerdings scheint es sich hierbei um kein konsistentes Kopieren zu handeln.</w:t>
+      </w:r>
+    </w:p>
+    <w:p>
+      <w:pPr>
+        <w:pStyle w:val="Listenabsatz"/>
+        <w:numPr>
+          <w:ilvl w:val="0"/>
+          <w:numId w:val="4"/>
+        </w:numPr>
+        <w:spacing w:before="120"/>
+        <w:ind w:left="357" w:hanging="357"/>
+        <w:jc w:val="both"/>
+      </w:pPr>
+      <w:r>
+        <w:t>Bytes Nr. 52 – 55 ändern sich von einer Session zur nächsten und werden in keine anderen Pakete kopiert.</w:t>
+      </w:r>
+    </w:p>
+    <w:p>
+      <w:pPr>
+        <w:rPr>
+          <w:rStyle w:val="Fett"/>
+        </w:rPr>
+      </w:pPr>
+      <w:r>
+        <w:rPr>
+          <w:rStyle w:val="Fett"/>
+        </w:rPr>
+        <w:lastRenderedPageBreak/>
         <w:t>Paket Nr. 3:</w:t>
+      </w:r>
+      <w:r>
+        <w:rPr>
+          <w:rStyle w:val="Fett"/>
+        </w:rPr>
+        <w:t xml:space="preserve"> 1 IN-Paket</w:t>
       </w:r>
     </w:p>
     <w:tbl>
@@ -5004,11 +5130,9 @@
             <w:tcW w:w="481" w:type="dxa"/>
           </w:tcPr>
           <w:p>
-            <w:proofErr w:type="spellStart"/>
             <w:r>
               <w:t>ce</w:t>
             </w:r>
-            <w:proofErr w:type="spellEnd"/>
           </w:p>
         </w:tc>
         <w:tc>
@@ -6088,10 +6212,11 @@
         <w:tc>
           <w:tcPr>
             <w:tcW w:w="481" w:type="dxa"/>
-          </w:tcPr>
-          <w:p>
-            <w:r>
-              <w:t>49</w:t>
+            <w:shd w:val="clear" w:color="auto" w:fill="92D050"/>
+          </w:tcPr>
+          <w:p>
+            <w:r>
+              <w:t>xx</w:t>
             </w:r>
           </w:p>
         </w:tc>
@@ -6241,23 +6366,72 @@
     </w:tbl>
     <w:p>
       <w:pPr>
+        <w:pStyle w:val="Listenabsatz"/>
+        <w:numPr>
+          <w:ilvl w:val="0"/>
+          <w:numId w:val="5"/>
+        </w:numPr>
         <w:spacing w:before="120"/>
+        <w:ind w:left="357" w:hanging="357"/>
+        <w:jc w:val="both"/>
       </w:pPr>
       <w:r>
-        <w:t>1 IN-Paket</w:t>
+        <w:t xml:space="preserve">Die Sequenz von Byte Nr. </w:t>
+      </w:r>
+      <w:r>
+        <w:t>42</w:t>
+      </w:r>
+      <w:r>
+        <w:t xml:space="preserve"> – 64 ist identisch zu Byte Nr. 2 – 24 von Paket Nr. 2</w:t>
+      </w:r>
+      <w:r>
+        <w:t xml:space="preserve">. </w:t>
       </w:r>
     </w:p>
     <w:p>
       <w:pPr>
+        <w:pStyle w:val="Listenabsatz"/>
+        <w:numPr>
+          <w:ilvl w:val="0"/>
+          <w:numId w:val="5"/>
+        </w:numPr>
         <w:spacing w:before="120"/>
+        <w:ind w:left="357" w:hanging="357"/>
+        <w:jc w:val="both"/>
       </w:pPr>
       <w:r>
-        <w:t>Die Sequenz von Byte Nr. 10 – 64 ist identisch zu Byte Nr. 2 – 24 von Paket Nr. 2.</w:t>
+        <w:t>Byte Nr. 28</w:t>
+      </w:r>
+      <w:r>
+        <w:t xml:space="preserve"> ändert sich von einer Session zur nächsten, der</w:t>
+      </w:r>
+      <w:r>
+        <w:t xml:space="preserve"> Wert </w:t>
+      </w:r>
+      <w:r>
+        <w:t>wird</w:t>
+      </w:r>
+      <w:r>
+        <w:t xml:space="preserve"> in keine anderen Pakete kopiert.</w:t>
       </w:r>
     </w:p>
     <w:p>
+      <w:pPr>
+        <w:rPr>
+          <w:rStyle w:val="Fett"/>
+        </w:rPr>
+      </w:pPr>
       <w:r>
+        <w:rPr>
+          <w:rStyle w:val="Fett"/>
+        </w:rPr>
         <w:t>Paket Nr. 4:</w:t>
+      </w:r>
+      <w:r>
+        <w:rPr>
+          <w:rStyle w:val="Fett"/>
+        </w:rPr>
+        <w:t xml:space="preserve"> 56 IN-Pakete</w:t>
       </w:r>
     </w:p>
     <w:tbl>
@@ -6995,7 +7169,7 @@
           </w:tcPr>
           <w:p>
             <w:r>
-              <w:t>47</w:t>
+              <w:t>xx</w:t>
             </w:r>
           </w:p>
         </w:tc>
@@ -7044,10 +7218,11 @@
         <w:tc>
           <w:tcPr>
             <w:tcW w:w="481" w:type="dxa"/>
-          </w:tcPr>
-          <w:p>
-            <w:r>
-              <w:t>4f</w:t>
+            <w:shd w:val="clear" w:color="auto" w:fill="FFFF00"/>
+          </w:tcPr>
+          <w:p>
+            <w:r>
+              <w:t>xx</w:t>
             </w:r>
           </w:p>
         </w:tc>
@@ -8133,17 +8308,17 @@
           </w:tcPr>
           <w:p>
             <w:r>
-              <w:t>03</w:t>
-            </w:r>
-          </w:p>
-        </w:tc>
-        <w:tc>
-          <w:tcPr>
-            <w:tcW w:w="481" w:type="dxa"/>
-          </w:tcPr>
-          <w:p>
-            <w:r>
-              <w:t>1b</w:t>
+              <w:t>xx</w:t>
+            </w:r>
+          </w:p>
+        </w:tc>
+        <w:tc>
+          <w:tcPr>
+            <w:tcW w:w="481" w:type="dxa"/>
+          </w:tcPr>
+          <w:p>
+            <w:r>
+              <w:t>xx</w:t>
             </w:r>
           </w:p>
         </w:tc>
@@ -8210,10 +8385,11 @@
         <w:tc>
           <w:tcPr>
             <w:tcW w:w="481" w:type="dxa"/>
-          </w:tcPr>
-          <w:p>
-            <w:r>
-              <w:t>49</w:t>
+            <w:shd w:val="clear" w:color="auto" w:fill="92D050"/>
+          </w:tcPr>
+          <w:p>
+            <w:r>
+              <w:t>xx</w:t>
             </w:r>
           </w:p>
         </w:tc>
@@ -8241,15 +8417,49 @@
     </w:tbl>
     <w:p>
       <w:pPr>
+        <w:pStyle w:val="Listenabsatz"/>
+        <w:numPr>
+          <w:ilvl w:val="0"/>
+          <w:numId w:val="6"/>
+        </w:numPr>
         <w:spacing w:before="120"/>
+        <w:ind w:left="357" w:hanging="357"/>
       </w:pPr>
       <w:r>
-        <w:t>56 IN-Pakete</w:t>
+        <w:t>Bytes Nr. 58 – 64 sind identisch mit Bytes Nr. 6 – 12 von Paket Nr. 2 und Bytes Nr. 46 – 52 von Paket Nr. 3.</w:t>
       </w:r>
     </w:p>
     <w:p>
+      <w:pPr>
+        <w:pStyle w:val="Listenabsatz"/>
+        <w:numPr>
+          <w:ilvl w:val="0"/>
+          <w:numId w:val="6"/>
+        </w:numPr>
+        <w:spacing w:before="120"/>
+        <w:ind w:left="357" w:hanging="357"/>
+      </w:pPr>
       <w:r>
+        <w:t>Bytes Nr. 4, 5, 20 – 23, sowie 54 und 55 ändern sich von einer Session zur nächsten und werden in keine anderen Pakete kopiert.</w:t>
+      </w:r>
+    </w:p>
+    <w:p>
+      <w:pPr>
+        <w:rPr>
+          <w:rStyle w:val="Fett"/>
+        </w:rPr>
+      </w:pPr>
+      <w:r>
+        <w:rPr>
+          <w:rStyle w:val="Fett"/>
+        </w:rPr>
         <w:t>Paket Nr. 5:</w:t>
+      </w:r>
+      <w:r>
+        <w:rPr>
+          <w:rStyle w:val="Fett"/>
+        </w:rPr>
+        <w:t xml:space="preserve"> 1 IN-Paket</w:t>
       </w:r>
     </w:p>
     <w:tbl>
@@ -9226,11 +9436,9 @@
             <w:tcW w:w="481" w:type="dxa"/>
           </w:tcPr>
           <w:p>
-            <w:proofErr w:type="spellStart"/>
             <w:r>
               <w:t>df</w:t>
             </w:r>
-            <w:proofErr w:type="spellEnd"/>
           </w:p>
         </w:tc>
         <w:tc>
@@ -9281,7 +9489,6 @@
                 <w:b/>
                 <w:bCs/>
               </w:rPr>
-              <w:lastRenderedPageBreak/>
               <w:t>33</w:t>
             </w:r>
           </w:p>
@@ -9921,10 +10128,11 @@
         <w:tc>
           <w:tcPr>
             <w:tcW w:w="480" w:type="dxa"/>
-          </w:tcPr>
-          <w:p>
-            <w:r>
-              <w:t>49</w:t>
+            <w:shd w:val="clear" w:color="auto" w:fill="92D050"/>
+          </w:tcPr>
+          <w:p>
+            <w:r>
+              <w:t>xx</w:t>
             </w:r>
           </w:p>
         </w:tc>
@@ -10155,11 +10363,9 @@
             <w:tcW w:w="481" w:type="dxa"/>
           </w:tcPr>
           <w:p>
-            <w:proofErr w:type="spellStart"/>
             <w:r>
               <w:t>df</w:t>
             </w:r>
-            <w:proofErr w:type="spellEnd"/>
           </w:p>
         </w:tc>
         <w:tc>
@@ -10238,15 +10444,48 @@
     </w:tbl>
     <w:p>
       <w:pPr>
+        <w:pStyle w:val="Listenabsatz"/>
+        <w:numPr>
+          <w:ilvl w:val="0"/>
+          <w:numId w:val="7"/>
+        </w:numPr>
         <w:spacing w:before="120"/>
       </w:pPr>
       <w:r>
-        <w:t>1 IN-Paket</w:t>
+        <w:t>Bytes Nr. 40 und 41 ändern sich von einer Session zur nächsten und werden in keine anderen Pakete kopiert.</w:t>
       </w:r>
     </w:p>
     <w:p>
+      <w:pPr>
+        <w:rPr>
+          <w:rStyle w:val="Fett"/>
+        </w:rPr>
+      </w:pPr>
       <w:r>
+        <w:rPr>
+          <w:rStyle w:val="Fett"/>
+        </w:rPr>
+        <w:br w:type="page"/>
+      </w:r>
+    </w:p>
+    <w:p>
+      <w:pPr>
+        <w:rPr>
+          <w:rStyle w:val="Fett"/>
+        </w:rPr>
+      </w:pPr>
+      <w:r>
+        <w:rPr>
+          <w:rStyle w:val="Fett"/>
+        </w:rPr>
+        <w:lastRenderedPageBreak/>
         <w:t>Paket Nr. 6:</w:t>
+      </w:r>
+      <w:r>
+        <w:rPr>
+          <w:rStyle w:val="Fett"/>
+        </w:rPr>
+        <w:t xml:space="preserve"> 1 IN-Paket</w:t>
       </w:r>
     </w:p>
     <w:tbl>
@@ -11067,11 +11306,9 @@
             <w:tcW w:w="481" w:type="dxa"/>
           </w:tcPr>
           <w:p>
-            <w:proofErr w:type="spellStart"/>
             <w:r>
               <w:t>df</w:t>
             </w:r>
-            <w:proofErr w:type="spellEnd"/>
           </w:p>
         </w:tc>
         <w:tc>
@@ -11117,7 +11354,7 @@
         <w:tc>
           <w:tcPr>
             <w:tcW w:w="481" w:type="dxa"/>
-            <w:shd w:val="clear" w:color="auto" w:fill="ADADAD" w:themeFill="background2" w:themeFillShade="BF"/>
+            <w:shd w:val="clear" w:color="auto" w:fill="002060"/>
           </w:tcPr>
           <w:p>
             <w:r>
@@ -11202,7 +11439,7 @@
         <w:tc>
           <w:tcPr>
             <w:tcW w:w="481" w:type="dxa"/>
-            <w:shd w:val="clear" w:color="auto" w:fill="196B24" w:themeFill="accent3"/>
+            <w:shd w:val="clear" w:color="auto" w:fill="EE0000"/>
           </w:tcPr>
           <w:p>
             <w:r>
@@ -11213,7 +11450,7 @@
         <w:tc>
           <w:tcPr>
             <w:tcW w:w="481" w:type="dxa"/>
-            <w:shd w:val="clear" w:color="auto" w:fill="196B24" w:themeFill="accent3"/>
+            <w:shd w:val="clear" w:color="auto" w:fill="EE0000"/>
           </w:tcPr>
           <w:p>
             <w:r>
@@ -11244,13 +11481,12 @@
         <w:tc>
           <w:tcPr>
             <w:tcW w:w="481" w:type="dxa"/>
-          </w:tcPr>
-          <w:p>
-            <w:proofErr w:type="spellStart"/>
-            <w:r>
-              <w:t>ea</w:t>
-            </w:r>
-            <w:proofErr w:type="spellEnd"/>
+            <w:shd w:val="clear" w:color="auto" w:fill="501549" w:themeFill="accent5" w:themeFillShade="80"/>
+          </w:tcPr>
+          <w:p>
+            <w:r>
+              <w:t>xx</w:t>
+            </w:r>
           </w:p>
         </w:tc>
         <w:tc>
@@ -11970,7 +12206,7 @@
         <w:tc>
           <w:tcPr>
             <w:tcW w:w="481" w:type="dxa"/>
-            <w:shd w:val="clear" w:color="auto" w:fill="ADADAD" w:themeFill="background2" w:themeFillShade="BF"/>
+            <w:shd w:val="clear" w:color="auto" w:fill="002060"/>
           </w:tcPr>
           <w:p>
             <w:r>
@@ -12034,7 +12270,7 @@
           </w:tcPr>
           <w:p>
             <w:r>
-              <w:t>xx</w:t>
+              <w:t>bf</w:t>
             </w:r>
           </w:p>
         </w:tc>
@@ -12246,15 +12482,116 @@
     </w:tbl>
     <w:p>
       <w:pPr>
+        <w:pStyle w:val="Listenabsatz"/>
+        <w:numPr>
+          <w:ilvl w:val="0"/>
+          <w:numId w:val="7"/>
+        </w:numPr>
         <w:spacing w:before="120"/>
+        <w:ind w:left="357" w:hanging="357"/>
+        <w:jc w:val="both"/>
       </w:pPr>
       <w:r>
-        <w:t>1 IN-Paket</w:t>
+        <w:t>Bytes Nr. 8 – 11 sind identisch mit Bytes Nr. 20 – 23, Bytes Nr. 50 und 51 sind identisch mit Bytes Nr. 56 und 57.</w:t>
       </w:r>
     </w:p>
     <w:p>
+      <w:pPr>
+        <w:pStyle w:val="Listenabsatz"/>
+        <w:numPr>
+          <w:ilvl w:val="0"/>
+          <w:numId w:val="7"/>
+        </w:numPr>
+        <w:spacing w:before="120"/>
+        <w:ind w:left="357" w:hanging="357"/>
+        <w:jc w:val="both"/>
+      </w:pPr>
       <w:r>
+        <w:t>Die Sequenz von Byte Nr. 48 – 57 ist in Paket Nr. 18 identisch.</w:t>
+      </w:r>
+      <w:r>
+        <w:t xml:space="preserve"> Byte Nr. 64 ist in Paket Nr. 18 ebenfalls identisch.</w:t>
+      </w:r>
+    </w:p>
+    <w:p>
+      <w:pPr>
+        <w:pStyle w:val="Listenabsatz"/>
+        <w:numPr>
+          <w:ilvl w:val="0"/>
+          <w:numId w:val="7"/>
+        </w:numPr>
+        <w:spacing w:before="120"/>
+        <w:ind w:left="357" w:hanging="357"/>
+        <w:jc w:val="both"/>
+      </w:pPr>
+      <w:r>
+        <w:t>Bytes Nr. 8 – 11, 20 – 27, 48 – 57 und 64 ändern sich von einer Session zur nächsten.</w:t>
+      </w:r>
+    </w:p>
+    <w:p>
+      <w:pPr>
+        <w:pStyle w:val="Listenabsatz"/>
+        <w:numPr>
+          <w:ilvl w:val="0"/>
+          <w:numId w:val="7"/>
+        </w:numPr>
+        <w:spacing w:before="120"/>
+        <w:ind w:left="357" w:hanging="357"/>
+        <w:jc w:val="both"/>
+      </w:pPr>
+      <w:r>
+        <w:t xml:space="preserve">Das erste Byte mit dem Wert 0x04 codiert das Setzen der Erfassungszeit, das zweite Byte codiert den Wert der Erfassungszeit, wie sie als Dezimalwert auf dem UI eingegeben wird (hier 0x32 </w:t>
+      </w:r>
+      <m:oMath>
+        <m:acc>
+          <m:accPr>
+            <m:ctrlPr>
+              <w:rPr>
+                <w:rFonts w:ascii="Cambria Math" w:hAnsi="Cambria Math"/>
+                <w:i/>
+              </w:rPr>
+            </m:ctrlPr>
+          </m:accPr>
+          <m:e>
+            <m:r>
+              <w:rPr>
+                <w:rFonts w:ascii="Cambria Math" w:hAnsi="Cambria Math"/>
+              </w:rPr>
+              <m:t>=</m:t>
+            </m:r>
+          </m:e>
+        </m:acc>
+      </m:oMath>
+      <w:r>
+        <w:rPr>
+          <w:rFonts w:eastAsiaTheme="minorEastAsia"/>
+        </w:rPr>
+        <w:t xml:space="preserve"> 50 ms)</w:t>
+      </w:r>
+      <w:r>
+        <w:rPr>
+          <w:rFonts w:eastAsiaTheme="minorEastAsia"/>
+        </w:rPr>
+        <w:t>.</w:t>
+      </w:r>
+    </w:p>
+    <w:p>
+      <w:pPr>
+        <w:rPr>
+          <w:rStyle w:val="Fett"/>
+        </w:rPr>
+      </w:pPr>
+      <w:r>
+        <w:rPr>
+          <w:rStyle w:val="Fett"/>
+        </w:rPr>
         <w:t>Paket Nr. 7:</w:t>
+      </w:r>
+      <w:r>
+        <w:rPr>
+          <w:rStyle w:val="Fett"/>
+        </w:rPr>
+        <w:t xml:space="preserve"> 56 IN-Pakete</w:t>
       </w:r>
     </w:p>
     <w:tbl>
@@ -13001,7 +13338,7 @@
         <w:tc>
           <w:tcPr>
             <w:tcW w:w="481" w:type="dxa"/>
-            <w:shd w:val="clear" w:color="auto" w:fill="E97132" w:themeFill="accent2"/>
+            <w:shd w:val="clear" w:color="auto" w:fill="FAE2D5" w:themeFill="accent2" w:themeFillTint="33"/>
           </w:tcPr>
           <w:p>
             <w:r>
@@ -13012,7 +13349,7 @@
         <w:tc>
           <w:tcPr>
             <w:tcW w:w="481" w:type="dxa"/>
-            <w:shd w:val="clear" w:color="auto" w:fill="E97132" w:themeFill="accent2"/>
+            <w:shd w:val="clear" w:color="auto" w:fill="FAE2D5" w:themeFill="accent2" w:themeFillTint="33"/>
           </w:tcPr>
           <w:p>
             <w:r>
@@ -13077,11 +13414,9 @@
             <w:tcW w:w="481" w:type="dxa"/>
           </w:tcPr>
           <w:p>
-            <w:proofErr w:type="spellStart"/>
             <w:r>
               <w:t>df</w:t>
             </w:r>
-            <w:proofErr w:type="spellEnd"/>
           </w:p>
         </w:tc>
         <w:tc>
@@ -13127,7 +13462,7 @@
         <w:tc>
           <w:tcPr>
             <w:tcW w:w="481" w:type="dxa"/>
-            <w:shd w:val="clear" w:color="auto" w:fill="196B24" w:themeFill="accent3"/>
+            <w:shd w:val="clear" w:color="auto" w:fill="EE0000"/>
           </w:tcPr>
           <w:p>
             <w:r>
@@ -13138,7 +13473,7 @@
         <w:tc>
           <w:tcPr>
             <w:tcW w:w="481" w:type="dxa"/>
-            <w:shd w:val="clear" w:color="auto" w:fill="196B24" w:themeFill="accent3"/>
+            <w:shd w:val="clear" w:color="auto" w:fill="EE0000"/>
           </w:tcPr>
           <w:p>
             <w:r>
@@ -13201,11 +13536,9 @@
             <w:tcW w:w="481" w:type="dxa"/>
           </w:tcPr>
           <w:p>
-            <w:proofErr w:type="spellStart"/>
             <w:r>
               <w:t>df</w:t>
             </w:r>
-            <w:proofErr w:type="spellEnd"/>
           </w:p>
         </w:tc>
         <w:tc>
@@ -13274,7 +13607,7 @@
           </w:tcPr>
           <w:p>
             <w:r>
-              <w:t>96</w:t>
+              <w:t>xx</w:t>
             </w:r>
           </w:p>
         </w:tc>
@@ -13968,7 +14301,7 @@
         <w:tc>
           <w:tcPr>
             <w:tcW w:w="481" w:type="dxa"/>
-            <w:shd w:val="clear" w:color="auto" w:fill="B3E5A1" w:themeFill="accent6" w:themeFillTint="66"/>
+            <w:shd w:val="clear" w:color="auto" w:fill="D9F2D0" w:themeFill="accent6" w:themeFillTint="33"/>
           </w:tcPr>
           <w:p>
             <w:r>
@@ -13979,7 +14312,7 @@
         <w:tc>
           <w:tcPr>
             <w:tcW w:w="481" w:type="dxa"/>
-            <w:shd w:val="clear" w:color="auto" w:fill="B3E5A1" w:themeFill="accent6" w:themeFillTint="66"/>
+            <w:shd w:val="clear" w:color="auto" w:fill="D9F2D0" w:themeFill="accent6" w:themeFillTint="33"/>
           </w:tcPr>
           <w:p>
             <w:r>
@@ -13990,7 +14323,7 @@
         <w:tc>
           <w:tcPr>
             <w:tcW w:w="481" w:type="dxa"/>
-            <w:shd w:val="clear" w:color="auto" w:fill="B3E5A1" w:themeFill="accent6" w:themeFillTint="66"/>
+            <w:shd w:val="clear" w:color="auto" w:fill="D9F2D0" w:themeFill="accent6" w:themeFillTint="33"/>
           </w:tcPr>
           <w:p>
             <w:r>
@@ -14103,7 +14436,7 @@
         <w:tc>
           <w:tcPr>
             <w:tcW w:w="481" w:type="dxa"/>
-            <w:shd w:val="clear" w:color="auto" w:fill="E97132" w:themeFill="accent2"/>
+            <w:shd w:val="clear" w:color="auto" w:fill="FAE2D5" w:themeFill="accent2" w:themeFillTint="33"/>
           </w:tcPr>
           <w:p>
             <w:r>
@@ -14114,7 +14447,7 @@
         <w:tc>
           <w:tcPr>
             <w:tcW w:w="481" w:type="dxa"/>
-            <w:shd w:val="clear" w:color="auto" w:fill="E97132" w:themeFill="accent2"/>
+            <w:shd w:val="clear" w:color="auto" w:fill="FAE2D5" w:themeFill="accent2" w:themeFillTint="33"/>
           </w:tcPr>
           <w:p>
             <w:r>
@@ -14147,7 +14480,7 @@
         <w:tc>
           <w:tcPr>
             <w:tcW w:w="481" w:type="dxa"/>
-            <w:shd w:val="clear" w:color="auto" w:fill="E97132" w:themeFill="accent2"/>
+            <w:shd w:val="clear" w:color="auto" w:fill="FAE2D5" w:themeFill="accent2" w:themeFillTint="33"/>
           </w:tcPr>
           <w:p>
             <w:r>
@@ -14158,7 +14491,7 @@
         <w:tc>
           <w:tcPr>
             <w:tcW w:w="481" w:type="dxa"/>
-            <w:shd w:val="clear" w:color="auto" w:fill="E97132" w:themeFill="accent2"/>
+            <w:shd w:val="clear" w:color="auto" w:fill="FAE2D5" w:themeFill="accent2" w:themeFillTint="33"/>
           </w:tcPr>
           <w:p>
             <w:r>
@@ -14180,7 +14513,7 @@
         <w:tc>
           <w:tcPr>
             <w:tcW w:w="481" w:type="dxa"/>
-            <w:shd w:val="clear" w:color="auto" w:fill="B3E5A1" w:themeFill="accent6" w:themeFillTint="66"/>
+            <w:shd w:val="clear" w:color="auto" w:fill="D9F2D0" w:themeFill="accent6" w:themeFillTint="33"/>
           </w:tcPr>
           <w:p>
             <w:r>
@@ -14191,7 +14524,7 @@
         <w:tc>
           <w:tcPr>
             <w:tcW w:w="481" w:type="dxa"/>
-            <w:shd w:val="clear" w:color="auto" w:fill="B3E5A1" w:themeFill="accent6" w:themeFillTint="66"/>
+            <w:shd w:val="clear" w:color="auto" w:fill="D9F2D0" w:themeFill="accent6" w:themeFillTint="33"/>
           </w:tcPr>
           <w:p>
             <w:r>
@@ -14202,7 +14535,7 @@
         <w:tc>
           <w:tcPr>
             <w:tcW w:w="481" w:type="dxa"/>
-            <w:shd w:val="clear" w:color="auto" w:fill="B3E5A1" w:themeFill="accent6" w:themeFillTint="66"/>
+            <w:shd w:val="clear" w:color="auto" w:fill="D9F2D0" w:themeFill="accent6" w:themeFillTint="33"/>
           </w:tcPr>
           <w:p>
             <w:r>
@@ -14266,27 +14599,60 @@
     </w:tbl>
     <w:p>
       <w:pPr>
+        <w:pStyle w:val="Listenabsatz"/>
+        <w:numPr>
+          <w:ilvl w:val="0"/>
+          <w:numId w:val="8"/>
+        </w:numPr>
         <w:spacing w:before="120"/>
+        <w:jc w:val="both"/>
       </w:pPr>
       <w:r>
-        <w:t>56 IN-Pakete</w:t>
+        <w:t>Alle 40er Pakete</w:t>
+      </w:r>
+      <w:r>
+        <w:t xml:space="preserve"> vom gleichen Typ wie Paket Nr. 7</w:t>
+      </w:r>
+      <w:r>
+        <w:t xml:space="preserve"> sind so aufgebaut, dass </w:t>
+      </w:r>
+      <w:r>
+        <w:t xml:space="preserve">die </w:t>
+      </w:r>
+      <w:r>
+        <w:t>Bytes 6</w:t>
+      </w:r>
+      <w:r>
+        <w:t xml:space="preserve"> und</w:t>
+      </w:r>
+      <w:r>
+        <w:t xml:space="preserve"> 7</w:t>
+      </w:r>
+      <w:r>
+        <w:t xml:space="preserve"> identisch</w:t>
+      </w:r>
+      <w:r>
+        <w:t xml:space="preserve"> sind</w:t>
+      </w:r>
+      <w:r>
+        <w:t xml:space="preserve"> mit 50 und 51, sowie 54 und 55</w:t>
+      </w:r>
+      <w:r>
+        <w:t>. Die Bytes 37 – 39 sind identisch mit 57 – 59. Diese Bytes ändern sich in unmittelbar aufeinanderfolgenden 40er Paketen nicht.</w:t>
       </w:r>
     </w:p>
     <w:p>
       <w:pPr>
+        <w:pStyle w:val="Listenabsatz"/>
+        <w:numPr>
+          <w:ilvl w:val="0"/>
+          <w:numId w:val="8"/>
+        </w:numPr>
         <w:spacing w:before="120"/>
+        <w:jc w:val="both"/>
       </w:pPr>
       <w:r>
-        <w:t>Alle 40er Pakete sind so aufgebaut, dass die Bytes 6, 7, 18, 19, 22 und 23</w:t>
-      </w:r>
-      <w:r>
-        <w:t xml:space="preserve"> sowie 37 – 39 und 57 - 59</w:t>
-      </w:r>
-      <w:r>
-        <w:t xml:space="preserve"> identisch sind und sich in unmittelbar aufeinanderfolgenden Paketen nicht ändern.</w:t>
-      </w:r>
-      <w:r>
-        <w:t xml:space="preserve"> Die Bytes 36 und 56 ändern sich in unmittelbar aufeinanderfolgenden 40er Paketen nicht. Zwischen Byte 36 und 56 liegt immer eine Differenz von – 10</w:t>
+        <w:t>Die Bytes 36 und 56 ändern sich in unmittelbar aufeinanderfolgenden 40er Paketen nicht. Zwischen Byte 36 und 56 liegt immer eine Differenz von – 10</w:t>
       </w:r>
       <w:r>
         <w:rPr>
@@ -14297,49 +14663,72 @@
       <w:r>
         <w:t>.</w:t>
       </w:r>
+    </w:p>
+    <w:p>
+      <w:pPr>
+        <w:pStyle w:val="Listenabsatz"/>
+        <w:numPr>
+          <w:ilvl w:val="0"/>
+          <w:numId w:val="8"/>
+        </w:numPr>
+        <w:spacing w:before="120"/>
+        <w:jc w:val="both"/>
+      </w:pPr>
       <w:r>
-        <w:t xml:space="preserve"> Die Bytes </w:t>
-      </w:r>
-      <w:r>
-        <w:t>34</w:t>
-      </w:r>
-      <w:r>
-        <w:t>, 3</w:t>
-      </w:r>
-      <w:r>
-        <w:t>5</w:t>
-      </w:r>
-      <w:r>
-        <w:t xml:space="preserve">, </w:t>
-      </w:r>
-      <w:r>
-        <w:t>40</w:t>
-      </w:r>
-      <w:r>
-        <w:t xml:space="preserve"> und </w:t>
-      </w:r>
-      <w:r>
-        <w:t>41,</w:t>
-      </w:r>
-      <w:r>
-        <w:t xml:space="preserve"> sowie 4, 5, </w:t>
-      </w:r>
-      <w:r>
-        <w:t>52</w:t>
-      </w:r>
-      <w:r>
-        <w:t xml:space="preserve"> und </w:t>
-      </w:r>
-      <w:r>
-        <w:t>53</w:t>
-      </w:r>
-      <w:r>
-        <w:t xml:space="preserve"> sind innerhalb eines Paketes identisch, ändern sich aber in aufeinanderfolgenden 40er Paketen. Die Bytes 4 – 7, 16 und 17</w:t>
+        <w:t>Die Bytes 16, 17, 32, 48 und 49 ändern sich in unmittelbar aufeinanderfolgenden 40er Paketen nicht.</w:t>
       </w:r>
     </w:p>
     <w:p>
+      <w:pPr>
+        <w:pStyle w:val="Listenabsatz"/>
+        <w:numPr>
+          <w:ilvl w:val="0"/>
+          <w:numId w:val="8"/>
+        </w:numPr>
+        <w:spacing w:before="120"/>
+        <w:jc w:val="both"/>
+      </w:pPr>
       <w:r>
+        <w:t>Die Bytes</w:t>
+      </w:r>
+      <w:r>
+        <w:t xml:space="preserve"> Nr. 4 und 5 sind innerhalb eines Paketes identisch mit Nr. 52 und 53, die Bytes Nr. 34 und 35 sind innerhalb eines Paketes identisch mit Nr. 52 und 53. Diese Bytes ändern sich in unmittelbar aufeinanderfolgenden 40er Paketen.</w:t>
+      </w:r>
+    </w:p>
+    <w:p>
+      <w:pPr>
+        <w:pStyle w:val="Listenabsatz"/>
+        <w:numPr>
+          <w:ilvl w:val="0"/>
+          <w:numId w:val="8"/>
+        </w:numPr>
+        <w:spacing w:before="120"/>
+        <w:jc w:val="both"/>
+      </w:pPr>
+      <w:r>
+        <w:t>Das Paket Nr. 7 unterscheidet sich an den Positionen 12 und 13 sowie 24 und 25 von den Paketen 8 – 17 bzw. 19 – 28. Diese Bytes ändern sich aber ansonsten weder von einer zur nächsten Session noch, wenn das Gerät neu verbunden wird.</w:t>
+      </w:r>
+    </w:p>
+    <w:p/>
+    <w:p/>
+    <w:p>
+      <w:pPr>
+        <w:rPr>
+          <w:rStyle w:val="Fett"/>
+        </w:rPr>
+      </w:pPr>
+      <w:r>
+        <w:rPr>
+          <w:rStyle w:val="Fett"/>
+        </w:rPr>
+        <w:lastRenderedPageBreak/>
         <w:t>Paket Nr. 8 – 17:</w:t>
+      </w:r>
+      <w:r>
+        <w:rPr>
+          <w:rStyle w:val="Fett"/>
+        </w:rPr>
+        <w:t xml:space="preserve"> 56 IN-Pakete</w:t>
       </w:r>
     </w:p>
     <w:tbl>
@@ -15086,7 +15475,7 @@
         <w:tc>
           <w:tcPr>
             <w:tcW w:w="481" w:type="dxa"/>
-            <w:shd w:val="clear" w:color="auto" w:fill="E97132" w:themeFill="accent2"/>
+            <w:shd w:val="clear" w:color="auto" w:fill="FAE2D5" w:themeFill="accent2" w:themeFillTint="33"/>
           </w:tcPr>
           <w:p>
             <w:r>
@@ -15097,7 +15486,7 @@
         <w:tc>
           <w:tcPr>
             <w:tcW w:w="481" w:type="dxa"/>
-            <w:shd w:val="clear" w:color="auto" w:fill="E97132" w:themeFill="accent2"/>
+            <w:shd w:val="clear" w:color="auto" w:fill="FAE2D5" w:themeFill="accent2" w:themeFillTint="33"/>
           </w:tcPr>
           <w:p>
             <w:r>
@@ -15128,6 +15517,7 @@
         <w:tc>
           <w:tcPr>
             <w:tcW w:w="481" w:type="dxa"/>
+            <w:shd w:val="clear" w:color="auto" w:fill="0F9ED5" w:themeFill="accent4"/>
           </w:tcPr>
           <w:p>
             <w:r>
@@ -15138,6 +15528,7 @@
         <w:tc>
           <w:tcPr>
             <w:tcW w:w="481" w:type="dxa"/>
+            <w:shd w:val="clear" w:color="auto" w:fill="0F9ED5" w:themeFill="accent4"/>
           </w:tcPr>
           <w:p>
             <w:r>
@@ -15208,7 +15599,7 @@
         <w:tc>
           <w:tcPr>
             <w:tcW w:w="481" w:type="dxa"/>
-            <w:shd w:val="clear" w:color="auto" w:fill="196B24" w:themeFill="accent3"/>
+            <w:shd w:val="clear" w:color="auto" w:fill="EE0000"/>
           </w:tcPr>
           <w:p>
             <w:r>
@@ -15219,7 +15610,7 @@
         <w:tc>
           <w:tcPr>
             <w:tcW w:w="481" w:type="dxa"/>
-            <w:shd w:val="clear" w:color="auto" w:fill="196B24" w:themeFill="accent3"/>
+            <w:shd w:val="clear" w:color="auto" w:fill="EE0000"/>
           </w:tcPr>
           <w:p>
             <w:r>
@@ -15353,7 +15744,7 @@
           </w:tcPr>
           <w:p>
             <w:r>
-              <w:t>96</w:t>
+              <w:t>xx</w:t>
             </w:r>
           </w:p>
         </w:tc>
@@ -16047,7 +16438,7 @@
         <w:tc>
           <w:tcPr>
             <w:tcW w:w="481" w:type="dxa"/>
-            <w:shd w:val="clear" w:color="auto" w:fill="B3E5A1" w:themeFill="accent6" w:themeFillTint="66"/>
+            <w:shd w:val="clear" w:color="auto" w:fill="D9F2D0" w:themeFill="accent6" w:themeFillTint="33"/>
           </w:tcPr>
           <w:p>
             <w:r>
@@ -16058,7 +16449,7 @@
         <w:tc>
           <w:tcPr>
             <w:tcW w:w="481" w:type="dxa"/>
-            <w:shd w:val="clear" w:color="auto" w:fill="B3E5A1" w:themeFill="accent6" w:themeFillTint="66"/>
+            <w:shd w:val="clear" w:color="auto" w:fill="D9F2D0" w:themeFill="accent6" w:themeFillTint="33"/>
           </w:tcPr>
           <w:p>
             <w:r>
@@ -16069,7 +16460,7 @@
         <w:tc>
           <w:tcPr>
             <w:tcW w:w="481" w:type="dxa"/>
-            <w:shd w:val="clear" w:color="auto" w:fill="B3E5A1" w:themeFill="accent6" w:themeFillTint="66"/>
+            <w:shd w:val="clear" w:color="auto" w:fill="D9F2D0" w:themeFill="accent6" w:themeFillTint="33"/>
           </w:tcPr>
           <w:p>
             <w:r>
@@ -16182,7 +16573,7 @@
         <w:tc>
           <w:tcPr>
             <w:tcW w:w="481" w:type="dxa"/>
-            <w:shd w:val="clear" w:color="auto" w:fill="E97132" w:themeFill="accent2"/>
+            <w:shd w:val="clear" w:color="auto" w:fill="FAE2D5" w:themeFill="accent2" w:themeFillTint="33"/>
           </w:tcPr>
           <w:p>
             <w:r>
@@ -16193,7 +16584,7 @@
         <w:tc>
           <w:tcPr>
             <w:tcW w:w="481" w:type="dxa"/>
-            <w:shd w:val="clear" w:color="auto" w:fill="E97132" w:themeFill="accent2"/>
+            <w:shd w:val="clear" w:color="auto" w:fill="FAE2D5" w:themeFill="accent2" w:themeFillTint="33"/>
           </w:tcPr>
           <w:p>
             <w:r>
@@ -16226,7 +16617,7 @@
         <w:tc>
           <w:tcPr>
             <w:tcW w:w="481" w:type="dxa"/>
-            <w:shd w:val="clear" w:color="auto" w:fill="E97132" w:themeFill="accent2"/>
+            <w:shd w:val="clear" w:color="auto" w:fill="FAE2D5" w:themeFill="accent2" w:themeFillTint="33"/>
           </w:tcPr>
           <w:p>
             <w:r>
@@ -16237,7 +16628,7 @@
         <w:tc>
           <w:tcPr>
             <w:tcW w:w="481" w:type="dxa"/>
-            <w:shd w:val="clear" w:color="auto" w:fill="E97132" w:themeFill="accent2"/>
+            <w:shd w:val="clear" w:color="auto" w:fill="FAE2D5" w:themeFill="accent2" w:themeFillTint="33"/>
           </w:tcPr>
           <w:p>
             <w:r>
@@ -16259,7 +16650,7 @@
         <w:tc>
           <w:tcPr>
             <w:tcW w:w="481" w:type="dxa"/>
-            <w:shd w:val="clear" w:color="auto" w:fill="B3E5A1" w:themeFill="accent6" w:themeFillTint="66"/>
+            <w:shd w:val="clear" w:color="auto" w:fill="D9F2D0" w:themeFill="accent6" w:themeFillTint="33"/>
           </w:tcPr>
           <w:p>
             <w:r>
@@ -16270,7 +16661,7 @@
         <w:tc>
           <w:tcPr>
             <w:tcW w:w="481" w:type="dxa"/>
-            <w:shd w:val="clear" w:color="auto" w:fill="B3E5A1" w:themeFill="accent6" w:themeFillTint="66"/>
+            <w:shd w:val="clear" w:color="auto" w:fill="D9F2D0" w:themeFill="accent6" w:themeFillTint="33"/>
           </w:tcPr>
           <w:p>
             <w:r>
@@ -16281,7 +16672,7 @@
         <w:tc>
           <w:tcPr>
             <w:tcW w:w="481" w:type="dxa"/>
-            <w:shd w:val="clear" w:color="auto" w:fill="B3E5A1" w:themeFill="accent6" w:themeFillTint="66"/>
+            <w:shd w:val="clear" w:color="auto" w:fill="D9F2D0" w:themeFill="accent6" w:themeFillTint="33"/>
           </w:tcPr>
           <w:p>
             <w:r>
@@ -16345,33 +16736,49 @@
     </w:tbl>
     <w:p>
       <w:pPr>
+        <w:pStyle w:val="Listenabsatz"/>
+        <w:numPr>
+          <w:ilvl w:val="0"/>
+          <w:numId w:val="9"/>
+        </w:numPr>
         <w:spacing w:before="120"/>
+        <w:jc w:val="both"/>
       </w:pPr>
       <w:r>
-        <w:t>56 IN-Pakete</w:t>
+        <w:t>Die Bytes Nr. 6, 7, 36 – 39, 50, 51, 54 – 59 sind identisch zu den gleichen Positionen der Pakete Nr. 7 und Nr. 19 – 28.</w:t>
       </w:r>
     </w:p>
     <w:p>
       <w:pPr>
+        <w:pStyle w:val="Listenabsatz"/>
+        <w:numPr>
+          <w:ilvl w:val="0"/>
+          <w:numId w:val="9"/>
+        </w:numPr>
         <w:spacing w:before="120"/>
+        <w:jc w:val="both"/>
       </w:pPr>
       <w:r>
-        <w:lastRenderedPageBreak/>
-        <w:t xml:space="preserve">Die Pakete Nr. 8 – 17 unterscheiden sich nur an den Positionen 4 und 5, 52 und 53 (gleich wie 4 und 5), 34 und 35, sowie 40 und 41 (gleich wie 34 und 35), alle anderen Positionen sind gleich. Die variablen Positionen, die während einer Sequenz von 40er Paketen </w:t>
-      </w:r>
-      <w:r>
-        <w:t>gleichbleiben</w:t>
-      </w:r>
-      <w:r>
-        <w:t xml:space="preserve">, sind auch identisch zu Paket Nr. </w:t>
-      </w:r>
-      <w:r>
-        <w:t>7. Das Paket Nr. 7 unterscheidet sich von Nr. 8 – 17 in den Positionen 12 und 13, sowie 24 und 25, diese Positionen sind ansonsten aber unabhängig von der aktuellen Session konstant.</w:t>
+        <w:t>Das Byte Nr. 32 ändert sich innerhalb unmittelbar aufeinanderfolgender 40er Pakete nicht, unterscheidet sich aber von Byte Nr. 32 in den Paketen Nr. 19 – 28.</w:t>
       </w:r>
     </w:p>
     <w:p>
+      <w:pPr>
+        <w:rPr>
+          <w:rStyle w:val="Fett"/>
+        </w:rPr>
+      </w:pPr>
       <w:r>
+        <w:rPr>
+          <w:rStyle w:val="Fett"/>
+        </w:rPr>
         <w:t>Paket Nr. 18:</w:t>
+      </w:r>
+      <w:r>
+        <w:rPr>
+          <w:rStyle w:val="Fett"/>
+        </w:rPr>
+        <w:t xml:space="preserve"> 1 IN-Paket</w:t>
       </w:r>
     </w:p>
     <w:tbl>
@@ -17136,6 +17543,7 @@
         <w:tc>
           <w:tcPr>
             <w:tcW w:w="481" w:type="dxa"/>
+            <w:shd w:val="clear" w:color="auto" w:fill="E8E8E8" w:themeFill="background2"/>
           </w:tcPr>
           <w:p>
             <w:r>
@@ -17146,6 +17554,7 @@
         <w:tc>
           <w:tcPr>
             <w:tcW w:w="481" w:type="dxa"/>
+            <w:shd w:val="clear" w:color="auto" w:fill="E8E8E8" w:themeFill="background2"/>
           </w:tcPr>
           <w:p>
             <w:r>
@@ -17156,6 +17565,7 @@
         <w:tc>
           <w:tcPr>
             <w:tcW w:w="481" w:type="dxa"/>
+            <w:shd w:val="clear" w:color="auto" w:fill="E8E8E8" w:themeFill="background2"/>
           </w:tcPr>
           <w:p>
             <w:r>
@@ -17166,6 +17576,7 @@
         <w:tc>
           <w:tcPr>
             <w:tcW w:w="481" w:type="dxa"/>
+            <w:shd w:val="clear" w:color="auto" w:fill="E8E8E8" w:themeFill="background2"/>
           </w:tcPr>
           <w:p>
             <w:r>
@@ -17236,6 +17647,7 @@
         <w:tc>
           <w:tcPr>
             <w:tcW w:w="481" w:type="dxa"/>
+            <w:shd w:val="clear" w:color="auto" w:fill="002060"/>
           </w:tcPr>
           <w:p>
             <w:r>
@@ -17256,6 +17668,7 @@
         <w:tc>
           <w:tcPr>
             <w:tcW w:w="481" w:type="dxa"/>
+            <w:shd w:val="clear" w:color="auto" w:fill="E8E8E8" w:themeFill="background2"/>
           </w:tcPr>
           <w:p>
             <w:r>
@@ -17266,6 +17679,7 @@
         <w:tc>
           <w:tcPr>
             <w:tcW w:w="481" w:type="dxa"/>
+            <w:shd w:val="clear" w:color="auto" w:fill="E8E8E8" w:themeFill="background2"/>
           </w:tcPr>
           <w:p>
             <w:r>
@@ -17276,6 +17690,7 @@
         <w:tc>
           <w:tcPr>
             <w:tcW w:w="481" w:type="dxa"/>
+            <w:shd w:val="clear" w:color="auto" w:fill="E8E8E8" w:themeFill="background2"/>
           </w:tcPr>
           <w:p>
             <w:r>
@@ -17286,6 +17701,7 @@
         <w:tc>
           <w:tcPr>
             <w:tcW w:w="481" w:type="dxa"/>
+            <w:shd w:val="clear" w:color="auto" w:fill="E8E8E8" w:themeFill="background2"/>
           </w:tcPr>
           <w:p>
             <w:r>
@@ -17316,7 +17732,7 @@
         <w:tc>
           <w:tcPr>
             <w:tcW w:w="481" w:type="dxa"/>
-            <w:shd w:val="clear" w:color="auto" w:fill="196B24" w:themeFill="accent3"/>
+            <w:shd w:val="clear" w:color="auto" w:fill="EE0000"/>
           </w:tcPr>
           <w:p>
             <w:r>
@@ -17327,7 +17743,7 @@
         <w:tc>
           <w:tcPr>
             <w:tcW w:w="481" w:type="dxa"/>
-            <w:shd w:val="clear" w:color="auto" w:fill="196B24" w:themeFill="accent3"/>
+            <w:shd w:val="clear" w:color="auto" w:fill="EE0000"/>
           </w:tcPr>
           <w:p>
             <w:r>
@@ -17358,13 +17774,12 @@
         <w:tc>
           <w:tcPr>
             <w:tcW w:w="481" w:type="dxa"/>
-          </w:tcPr>
-          <w:p>
-            <w:proofErr w:type="spellStart"/>
-            <w:r>
-              <w:t>ea</w:t>
-            </w:r>
-            <w:proofErr w:type="spellEnd"/>
+            <w:shd w:val="clear" w:color="auto" w:fill="501549" w:themeFill="accent5" w:themeFillShade="80"/>
+          </w:tcPr>
+          <w:p>
+            <w:r>
+              <w:t>xx</w:t>
+            </w:r>
           </w:p>
         </w:tc>
         <w:tc>
@@ -18084,6 +18499,7 @@
         <w:tc>
           <w:tcPr>
             <w:tcW w:w="481" w:type="dxa"/>
+            <w:shd w:val="clear" w:color="auto" w:fill="002060"/>
           </w:tcPr>
           <w:p>
             <w:r>
@@ -18146,11 +18562,9 @@
             <w:tcW w:w="481" w:type="dxa"/>
           </w:tcPr>
           <w:p>
-            <w:proofErr w:type="spellStart"/>
             <w:r>
               <w:t>bf</w:t>
             </w:r>
-            <w:proofErr w:type="spellEnd"/>
           </w:p>
         </w:tc>
         <w:tc>
@@ -18206,6 +18620,7 @@
         <w:tc>
           <w:tcPr>
             <w:tcW w:w="481" w:type="dxa"/>
+            <w:shd w:val="clear" w:color="auto" w:fill="CAEDFB" w:themeFill="accent4" w:themeFillTint="33"/>
           </w:tcPr>
           <w:p>
             <w:r>
@@ -18216,6 +18631,7 @@
         <w:tc>
           <w:tcPr>
             <w:tcW w:w="481" w:type="dxa"/>
+            <w:shd w:val="clear" w:color="auto" w:fill="CAEDFB" w:themeFill="accent4" w:themeFillTint="33"/>
           </w:tcPr>
           <w:p>
             <w:r>
@@ -18266,6 +18682,7 @@
         <w:tc>
           <w:tcPr>
             <w:tcW w:w="481" w:type="dxa"/>
+            <w:shd w:val="clear" w:color="auto" w:fill="CAEDFB" w:themeFill="accent4" w:themeFillTint="33"/>
           </w:tcPr>
           <w:p>
             <w:r>
@@ -18276,6 +18693,7 @@
         <w:tc>
           <w:tcPr>
             <w:tcW w:w="481" w:type="dxa"/>
+            <w:shd w:val="clear" w:color="auto" w:fill="CAEDFB" w:themeFill="accent4" w:themeFillTint="33"/>
           </w:tcPr>
           <w:p>
             <w:r>
@@ -18356,13 +18774,144 @@
       </w:tr>
     </w:tbl>
     <w:p>
+      <w:pPr>
+        <w:pStyle w:val="Listenabsatz"/>
+        <w:numPr>
+          <w:ilvl w:val="0"/>
+          <w:numId w:val="7"/>
+        </w:numPr>
+        <w:spacing w:before="120"/>
+        <w:ind w:left="357" w:hanging="357"/>
+        <w:jc w:val="both"/>
+      </w:pPr>
       <w:r>
-        <w:t>1 IN-Paket</w:t>
+        <w:t>Bytes Nr. 8 – 11 sind identisch mit Bytes Nr. 20 – 23, Bytes Nr. 50 und 51 sind identisch mit Bytes Nr. 56 und 57.</w:t>
       </w:r>
     </w:p>
     <w:p>
+      <w:pPr>
+        <w:pStyle w:val="Listenabsatz"/>
+        <w:numPr>
+          <w:ilvl w:val="0"/>
+          <w:numId w:val="7"/>
+        </w:numPr>
+        <w:spacing w:before="120"/>
+        <w:ind w:left="357" w:hanging="357"/>
+        <w:jc w:val="both"/>
+      </w:pPr>
       <w:r>
+        <w:t xml:space="preserve">Die Sequenz von Byte Nr. 48 – 57 ist in Paket Nr. </w:t>
+      </w:r>
+      <w:r>
+        <w:t>6</w:t>
+      </w:r>
+      <w:r>
+        <w:t xml:space="preserve"> identisch. Byte Nr. 64 ist in Paket Nr. </w:t>
+      </w:r>
+      <w:r>
+        <w:t>6</w:t>
+      </w:r>
+      <w:r>
+        <w:t xml:space="preserve"> ebenfalls identisch.</w:t>
+      </w:r>
+    </w:p>
+    <w:p>
+      <w:pPr>
+        <w:pStyle w:val="Listenabsatz"/>
+        <w:numPr>
+          <w:ilvl w:val="0"/>
+          <w:numId w:val="7"/>
+        </w:numPr>
+        <w:spacing w:before="120"/>
+        <w:ind w:left="357" w:hanging="357"/>
+        <w:jc w:val="both"/>
+      </w:pPr>
+      <w:r>
+        <w:t>Bytes Nr. 8 – 11, 20 – 27, 48 – 57 und 64 ändern sich von einer Session zur nächsten.</w:t>
+      </w:r>
+    </w:p>
+    <w:p>
+      <w:pPr>
+        <w:pStyle w:val="Listenabsatz"/>
+        <w:numPr>
+          <w:ilvl w:val="0"/>
+          <w:numId w:val="7"/>
+        </w:numPr>
+        <w:spacing w:before="120"/>
+        <w:ind w:left="357" w:hanging="357"/>
+        <w:jc w:val="both"/>
+      </w:pPr>
+      <w:r>
+        <w:t>Das erste Byte mit dem Wert 0x04 codiert das Setzen der Erfassungszeit, das zweite Byte codiert den Wert der Erfassungszeit, wie sie als Dezimalwert auf dem UI eingegeben wird (hier 0x</w:t>
+      </w:r>
+      <w:r>
+        <w:t>0f</w:t>
+      </w:r>
+      <w:r>
+        <w:t xml:space="preserve"> </w:t>
+      </w:r>
+      <m:oMath>
+        <m:acc>
+          <m:accPr>
+            <m:ctrlPr>
+              <w:rPr>
+                <w:rFonts w:ascii="Cambria Math" w:hAnsi="Cambria Math"/>
+                <w:i/>
+              </w:rPr>
+            </m:ctrlPr>
+          </m:accPr>
+          <m:e>
+            <m:r>
+              <w:rPr>
+                <w:rFonts w:ascii="Cambria Math" w:hAnsi="Cambria Math"/>
+              </w:rPr>
+              <m:t>=</m:t>
+            </m:r>
+          </m:e>
+        </m:acc>
+      </m:oMath>
+      <w:r>
+        <w:rPr>
+          <w:rFonts w:eastAsiaTheme="minorEastAsia"/>
+        </w:rPr>
+        <w:t xml:space="preserve"> </w:t>
+      </w:r>
+      <w:r>
+        <w:rPr>
+          <w:rFonts w:eastAsiaTheme="minorEastAsia"/>
+        </w:rPr>
+        <w:t>15</w:t>
+      </w:r>
+      <w:r>
+        <w:rPr>
+          <w:rFonts w:eastAsiaTheme="minorEastAsia"/>
+        </w:rPr>
+        <w:t xml:space="preserve"> ms)</w:t>
+      </w:r>
+      <w:r>
+        <w:rPr>
+          <w:rFonts w:eastAsiaTheme="minorEastAsia"/>
+        </w:rPr>
+        <w:t>.</w:t>
+      </w:r>
+    </w:p>
+    <w:p>
+      <w:pPr>
+        <w:rPr>
+          <w:rStyle w:val="Fett"/>
+        </w:rPr>
+      </w:pPr>
+      <w:r>
+        <w:rPr>
+          <w:rStyle w:val="Fett"/>
+        </w:rPr>
         <w:t>Paket Nr. 19 – 28:</w:t>
+      </w:r>
+      <w:r>
+        <w:rPr>
+          <w:rStyle w:val="Fett"/>
+        </w:rPr>
+        <w:t xml:space="preserve"> 56 IN-Pakete</w:t>
       </w:r>
     </w:p>
     <w:tbl>
@@ -19087,6 +19636,7 @@
         <w:tc>
           <w:tcPr>
             <w:tcW w:w="480" w:type="dxa"/>
+            <w:shd w:val="clear" w:color="auto" w:fill="ADADAD" w:themeFill="background2" w:themeFillShade="BF"/>
           </w:tcPr>
           <w:p>
             <w:r>
@@ -19097,6 +19647,7 @@
         <w:tc>
           <w:tcPr>
             <w:tcW w:w="481" w:type="dxa"/>
+            <w:shd w:val="clear" w:color="auto" w:fill="ADADAD" w:themeFill="background2" w:themeFillShade="BF"/>
           </w:tcPr>
           <w:p>
             <w:r>
@@ -19107,6 +19658,7 @@
         <w:tc>
           <w:tcPr>
             <w:tcW w:w="481" w:type="dxa"/>
+            <w:shd w:val="clear" w:color="auto" w:fill="FAE2D5" w:themeFill="accent2" w:themeFillTint="33"/>
           </w:tcPr>
           <w:p>
             <w:r>
@@ -19117,6 +19669,7 @@
         <w:tc>
           <w:tcPr>
             <w:tcW w:w="481" w:type="dxa"/>
+            <w:shd w:val="clear" w:color="auto" w:fill="FAE2D5" w:themeFill="accent2" w:themeFillTint="33"/>
           </w:tcPr>
           <w:p>
             <w:r>
@@ -19147,6 +19700,7 @@
         <w:tc>
           <w:tcPr>
             <w:tcW w:w="481" w:type="dxa"/>
+            <w:shd w:val="clear" w:color="auto" w:fill="0F9ED5" w:themeFill="accent4"/>
           </w:tcPr>
           <w:p>
             <w:r>
@@ -19157,6 +19711,7 @@
         <w:tc>
           <w:tcPr>
             <w:tcW w:w="481" w:type="dxa"/>
+            <w:shd w:val="clear" w:color="auto" w:fill="0F9ED5" w:themeFill="accent4"/>
           </w:tcPr>
           <w:p>
             <w:r>
@@ -19227,7 +19782,7 @@
         <w:tc>
           <w:tcPr>
             <w:tcW w:w="481" w:type="dxa"/>
-            <w:shd w:val="clear" w:color="auto" w:fill="196B24" w:themeFill="accent3"/>
+            <w:shd w:val="clear" w:color="auto" w:fill="EE0000"/>
           </w:tcPr>
           <w:p>
             <w:r>
@@ -19238,7 +19793,7 @@
         <w:tc>
           <w:tcPr>
             <w:tcW w:w="481" w:type="dxa"/>
-            <w:shd w:val="clear" w:color="auto" w:fill="196B24" w:themeFill="accent3"/>
+            <w:shd w:val="clear" w:color="auto" w:fill="EE0000"/>
           </w:tcPr>
           <w:p>
             <w:r>
@@ -19372,7 +19927,7 @@
           </w:tcPr>
           <w:p>
             <w:r>
-              <w:t>96</w:t>
+              <w:t>xx</w:t>
             </w:r>
           </w:p>
         </w:tc>
@@ -20033,6 +20588,7 @@
         <w:tc>
           <w:tcPr>
             <w:tcW w:w="480" w:type="dxa"/>
+            <w:shd w:val="clear" w:color="auto" w:fill="E8E8E8" w:themeFill="background2"/>
           </w:tcPr>
           <w:p>
             <w:r>
@@ -20043,6 +20599,7 @@
         <w:tc>
           <w:tcPr>
             <w:tcW w:w="480" w:type="dxa"/>
+            <w:shd w:val="clear" w:color="auto" w:fill="E8E8E8" w:themeFill="background2"/>
           </w:tcPr>
           <w:p>
             <w:r>
@@ -20053,6 +20610,7 @@
         <w:tc>
           <w:tcPr>
             <w:tcW w:w="480" w:type="dxa"/>
+            <w:shd w:val="clear" w:color="auto" w:fill="F2CEED" w:themeFill="accent5" w:themeFillTint="33"/>
           </w:tcPr>
           <w:p>
             <w:r>
@@ -20063,6 +20621,7 @@
         <w:tc>
           <w:tcPr>
             <w:tcW w:w="481" w:type="dxa"/>
+            <w:shd w:val="clear" w:color="auto" w:fill="D9F2D0" w:themeFill="accent6" w:themeFillTint="33"/>
           </w:tcPr>
           <w:p>
             <w:r>
@@ -20073,6 +20632,7 @@
         <w:tc>
           <w:tcPr>
             <w:tcW w:w="481" w:type="dxa"/>
+            <w:shd w:val="clear" w:color="auto" w:fill="D9F2D0" w:themeFill="accent6" w:themeFillTint="33"/>
           </w:tcPr>
           <w:p>
             <w:r>
@@ -20083,6 +20643,7 @@
         <w:tc>
           <w:tcPr>
             <w:tcW w:w="481" w:type="dxa"/>
+            <w:shd w:val="clear" w:color="auto" w:fill="D9F2D0" w:themeFill="accent6" w:themeFillTint="33"/>
           </w:tcPr>
           <w:p>
             <w:r>
@@ -20093,6 +20654,7 @@
         <w:tc>
           <w:tcPr>
             <w:tcW w:w="481" w:type="dxa"/>
+            <w:shd w:val="clear" w:color="auto" w:fill="E8E8E8" w:themeFill="background2"/>
           </w:tcPr>
           <w:p>
             <w:r>
@@ -20103,6 +20665,7 @@
         <w:tc>
           <w:tcPr>
             <w:tcW w:w="481" w:type="dxa"/>
+            <w:shd w:val="clear" w:color="auto" w:fill="E8E8E8" w:themeFill="background2"/>
           </w:tcPr>
           <w:p>
             <w:r>
@@ -20193,6 +20756,7 @@
         <w:tc>
           <w:tcPr>
             <w:tcW w:w="481" w:type="dxa"/>
+            <w:shd w:val="clear" w:color="auto" w:fill="FAE2D5" w:themeFill="accent2" w:themeFillTint="33"/>
           </w:tcPr>
           <w:p>
             <w:r>
@@ -20203,6 +20767,7 @@
         <w:tc>
           <w:tcPr>
             <w:tcW w:w="481" w:type="dxa"/>
+            <w:shd w:val="clear" w:color="auto" w:fill="FAE2D5" w:themeFill="accent2" w:themeFillTint="33"/>
           </w:tcPr>
           <w:p>
             <w:r>
@@ -20213,6 +20778,7 @@
         <w:tc>
           <w:tcPr>
             <w:tcW w:w="481" w:type="dxa"/>
+            <w:shd w:val="clear" w:color="auto" w:fill="ADADAD" w:themeFill="background2" w:themeFillShade="BF"/>
           </w:tcPr>
           <w:p>
             <w:r>
@@ -20223,6 +20789,7 @@
         <w:tc>
           <w:tcPr>
             <w:tcW w:w="481" w:type="dxa"/>
+            <w:shd w:val="clear" w:color="auto" w:fill="ADADAD" w:themeFill="background2" w:themeFillShade="BF"/>
           </w:tcPr>
           <w:p>
             <w:r>
@@ -20233,6 +20800,7 @@
         <w:tc>
           <w:tcPr>
             <w:tcW w:w="481" w:type="dxa"/>
+            <w:shd w:val="clear" w:color="auto" w:fill="FAE2D5" w:themeFill="accent2" w:themeFillTint="33"/>
           </w:tcPr>
           <w:p>
             <w:r>
@@ -20243,6 +20811,7 @@
         <w:tc>
           <w:tcPr>
             <w:tcW w:w="481" w:type="dxa"/>
+            <w:shd w:val="clear" w:color="auto" w:fill="FAE2D5" w:themeFill="accent2" w:themeFillTint="33"/>
           </w:tcPr>
           <w:p>
             <w:r>
@@ -20253,6 +20822,7 @@
         <w:tc>
           <w:tcPr>
             <w:tcW w:w="481" w:type="dxa"/>
+            <w:shd w:val="clear" w:color="auto" w:fill="D86DCB" w:themeFill="accent5" w:themeFillTint="99"/>
           </w:tcPr>
           <w:p>
             <w:r>
@@ -20263,6 +20833,7 @@
         <w:tc>
           <w:tcPr>
             <w:tcW w:w="481" w:type="dxa"/>
+            <w:shd w:val="clear" w:color="auto" w:fill="D9F2D0" w:themeFill="accent6" w:themeFillTint="33"/>
           </w:tcPr>
           <w:p>
             <w:r>
@@ -20273,6 +20844,7 @@
         <w:tc>
           <w:tcPr>
             <w:tcW w:w="481" w:type="dxa"/>
+            <w:shd w:val="clear" w:color="auto" w:fill="D9F2D0" w:themeFill="accent6" w:themeFillTint="33"/>
           </w:tcPr>
           <w:p>
             <w:r>
@@ -20283,6 +20855,7 @@
         <w:tc>
           <w:tcPr>
             <w:tcW w:w="481" w:type="dxa"/>
+            <w:shd w:val="clear" w:color="auto" w:fill="D9F2D0" w:themeFill="accent6" w:themeFillTint="33"/>
           </w:tcPr>
           <w:p>
             <w:r>
@@ -20346,15 +20919,74 @@
     </w:tbl>
     <w:p>
       <w:pPr>
+        <w:pStyle w:val="Listenabsatz"/>
+        <w:numPr>
+          <w:ilvl w:val="0"/>
+          <w:numId w:val="9"/>
+        </w:numPr>
         <w:spacing w:before="120"/>
+        <w:jc w:val="both"/>
       </w:pPr>
       <w:r>
-        <w:t>56 IN-Pakete</w:t>
+        <w:t xml:space="preserve">Die Bytes Nr. 6, 7, 36 – 39, 50, 51, 54 – 59 sind identisch zu den gleichen Positionen der Pakete Nr. 7 und Nr. </w:t>
+      </w:r>
+      <w:r>
+        <w:t>8</w:t>
+      </w:r>
+      <w:r>
+        <w:t xml:space="preserve"> – </w:t>
+      </w:r>
+      <w:r>
+        <w:t>17</w:t>
+      </w:r>
+      <w:r>
+        <w:t>.</w:t>
       </w:r>
     </w:p>
     <w:p>
+      <w:pPr>
+        <w:pStyle w:val="Listenabsatz"/>
+        <w:numPr>
+          <w:ilvl w:val="0"/>
+          <w:numId w:val="9"/>
+        </w:numPr>
+        <w:spacing w:before="120"/>
+        <w:jc w:val="both"/>
+      </w:pPr>
       <w:r>
+        <w:t xml:space="preserve">Das Byte Nr. 32 ändert sich innerhalb unmittelbar aufeinanderfolgender 40er Pakete nicht, unterscheidet sich aber von Byte Nr. 32 in den Paketen Nr. </w:t>
+      </w:r>
+      <w:r>
+        <w:t>7</w:t>
+      </w:r>
+      <w:r>
+        <w:t xml:space="preserve"> – </w:t>
+      </w:r>
+      <w:r>
+        <w:t>17</w:t>
+      </w:r>
+      <w:r>
+        <w:t>.</w:t>
+      </w:r>
+    </w:p>
+    <w:p>
+      <w:pPr>
+        <w:rPr>
+          <w:rStyle w:val="Fett"/>
+        </w:rPr>
+      </w:pPr>
+      <w:r>
+        <w:rPr>
+          <w:rStyle w:val="Fett"/>
+        </w:rPr>
+        <w:lastRenderedPageBreak/>
         <w:t>Paket Nr. 29:</w:t>
+      </w:r>
+      <w:r>
+        <w:rPr>
+          <w:rStyle w:val="Fett"/>
+        </w:rPr>
+        <w:t xml:space="preserve"> 1 IN-Paket</w:t>
       </w:r>
     </w:p>
     <w:tbl>
@@ -22137,11 +22769,9 @@
             <w:tcW w:w="481" w:type="dxa"/>
           </w:tcPr>
           <w:p>
-            <w:proofErr w:type="spellStart"/>
             <w:r>
               <w:t>ea</w:t>
             </w:r>
-            <w:proofErr w:type="spellEnd"/>
           </w:p>
         </w:tc>
         <w:tc>
@@ -22169,11 +22799,9 @@
             <w:tcW w:w="481" w:type="dxa"/>
           </w:tcPr>
           <w:p>
-            <w:proofErr w:type="spellStart"/>
             <w:r>
               <w:t>aa</w:t>
             </w:r>
-            <w:proofErr w:type="spellEnd"/>
           </w:p>
         </w:tc>
         <w:tc>
@@ -22189,10 +22817,11 @@
         <w:tc>
           <w:tcPr>
             <w:tcW w:w="481" w:type="dxa"/>
-          </w:tcPr>
-          <w:p>
-            <w:r>
-              <w:t>49</w:t>
+            <w:shd w:val="clear" w:color="auto" w:fill="92D050"/>
+          </w:tcPr>
+          <w:p>
+            <w:r>
+              <w:t>xx</w:t>
             </w:r>
           </w:p>
         </w:tc>
@@ -22342,15 +22971,21 @@
     </w:tbl>
     <w:p>
       <w:pPr>
-        <w:spacing w:before="120"/>
+        <w:rPr>
+          <w:rStyle w:val="Fett"/>
+        </w:rPr>
       </w:pPr>
       <w:r>
-        <w:t>1 IN-Paket</w:t>
+        <w:rPr>
+          <w:rStyle w:val="Fett"/>
+        </w:rPr>
+        <w:t>Paket Nr. 30:</w:t>
       </w:r>
-    </w:p>
-    <w:p>
       <w:r>
-        <w:t>Paket Nr. 30:</w:t>
+        <w:rPr>
+          <w:rStyle w:val="Fett"/>
+        </w:rPr>
+        <w:t xml:space="preserve"> 1 IN-Paket</w:t>
       </w:r>
     </w:p>
     <w:tbl>
@@ -23297,11 +23932,9 @@
             <w:tcW w:w="481" w:type="dxa"/>
           </w:tcPr>
           <w:p>
-            <w:proofErr w:type="spellStart"/>
             <w:r>
               <w:t>fc</w:t>
             </w:r>
-            <w:proofErr w:type="spellEnd"/>
           </w:p>
         </w:tc>
         <w:tc>
@@ -23382,7 +24015,6 @@
                 <w:b/>
                 <w:bCs/>
               </w:rPr>
-              <w:lastRenderedPageBreak/>
               <w:t>33</w:t>
             </w:r>
           </w:p>
@@ -24044,11 +24676,9 @@
             <w:tcW w:w="480" w:type="dxa"/>
           </w:tcPr>
           <w:p>
-            <w:proofErr w:type="spellStart"/>
             <w:r>
               <w:t>ac</w:t>
             </w:r>
-            <w:proofErr w:type="spellEnd"/>
           </w:p>
         </w:tc>
         <w:tc>
@@ -24084,6 +24714,7 @@
         <w:tc>
           <w:tcPr>
             <w:tcW w:w="481" w:type="dxa"/>
+            <w:shd w:val="clear" w:color="auto" w:fill="F2CEED" w:themeFill="accent5" w:themeFillTint="33"/>
           </w:tcPr>
           <w:p>
             <w:r>
@@ -24094,6 +24725,7 @@
         <w:tc>
           <w:tcPr>
             <w:tcW w:w="481" w:type="dxa"/>
+            <w:shd w:val="clear" w:color="auto" w:fill="F2CEED" w:themeFill="accent5" w:themeFillTint="33"/>
           </w:tcPr>
           <w:p>
             <w:r>
@@ -24104,6 +24736,7 @@
         <w:tc>
           <w:tcPr>
             <w:tcW w:w="481" w:type="dxa"/>
+            <w:shd w:val="clear" w:color="auto" w:fill="F2CEED" w:themeFill="accent5" w:themeFillTint="33"/>
           </w:tcPr>
           <w:p>
             <w:r>
@@ -24114,6 +24747,7 @@
         <w:tc>
           <w:tcPr>
             <w:tcW w:w="481" w:type="dxa"/>
+            <w:shd w:val="clear" w:color="auto" w:fill="F2CEED" w:themeFill="accent5" w:themeFillTint="33"/>
           </w:tcPr>
           <w:p>
             <w:r>
@@ -24136,11 +24770,9 @@
             <w:tcW w:w="481" w:type="dxa"/>
           </w:tcPr>
           <w:p>
-            <w:proofErr w:type="spellStart"/>
             <w:r>
               <w:t>ea</w:t>
             </w:r>
-            <w:proofErr w:type="spellEnd"/>
           </w:p>
         </w:tc>
         <w:tc>
@@ -24186,26 +24818,7 @@
         <w:tc>
           <w:tcPr>
             <w:tcW w:w="481" w:type="dxa"/>
-          </w:tcPr>
-          <w:p>
-            <w:r>
-              <w:t>b3</w:t>
-            </w:r>
-          </w:p>
-        </w:tc>
-        <w:tc>
-          <w:tcPr>
-            <w:tcW w:w="481" w:type="dxa"/>
-          </w:tcPr>
-          <w:p>
-            <w:r>
-              <w:t>76</w:t>
-            </w:r>
-          </w:p>
-        </w:tc>
-        <w:tc>
-          <w:tcPr>
-            <w:tcW w:w="481" w:type="dxa"/>
+            <w:shd w:val="clear" w:color="auto" w:fill="00FFFF"/>
           </w:tcPr>
           <w:p>
             <w:r>
@@ -24216,6 +24829,7 @@
         <w:tc>
           <w:tcPr>
             <w:tcW w:w="481" w:type="dxa"/>
+            <w:shd w:val="clear" w:color="auto" w:fill="00FFFF"/>
           </w:tcPr>
           <w:p>
             <w:r>
@@ -24248,11 +24862,29 @@
             <w:tcW w:w="481" w:type="dxa"/>
           </w:tcPr>
           <w:p>
-            <w:proofErr w:type="spellStart"/>
+            <w:r>
+              <w:t>xx</w:t>
+            </w:r>
+          </w:p>
+        </w:tc>
+        <w:tc>
+          <w:tcPr>
+            <w:tcW w:w="481" w:type="dxa"/>
+          </w:tcPr>
+          <w:p>
+            <w:r>
+              <w:t>xx</w:t>
+            </w:r>
+          </w:p>
+        </w:tc>
+        <w:tc>
+          <w:tcPr>
+            <w:tcW w:w="481" w:type="dxa"/>
+          </w:tcPr>
+          <w:p>
             <w:r>
               <w:t>fe</w:t>
             </w:r>
-            <w:proofErr w:type="spellEnd"/>
           </w:p>
         </w:tc>
         <w:tc>
@@ -24300,11 +24932,9 @@
             <w:tcW w:w="481" w:type="dxa"/>
           </w:tcPr>
           <w:p>
-            <w:proofErr w:type="spellStart"/>
             <w:r>
               <w:t>ea</w:t>
             </w:r>
-            <w:proofErr w:type="spellEnd"/>
           </w:p>
         </w:tc>
         <w:tc>
@@ -24341,15 +24971,99 @@
     </w:tbl>
     <w:p>
       <w:pPr>
-        <w:spacing w:before="120"/>
+        <w:pStyle w:val="Listenabsatz"/>
+        <w:numPr>
+          <w:ilvl w:val="0"/>
+          <w:numId w:val="10"/>
+        </w:numPr>
+        <w:ind w:left="357" w:hanging="357"/>
+        <w:jc w:val="both"/>
+        <w:rPr>
+          <w:rStyle w:val="Fett"/>
+          <w:b w:val="0"/>
+          <w:bCs w:val="0"/>
+          <w:color w:val="000000" w:themeColor="text1"/>
+        </w:rPr>
       </w:pPr>
       <w:r>
-        <w:t>1 IN-Paket</w:t>
+        <w:rPr>
+          <w:rStyle w:val="Fett"/>
+          <w:b w:val="0"/>
+          <w:bCs w:val="0"/>
+          <w:color w:val="000000" w:themeColor="text1"/>
+        </w:rPr>
+        <w:t>Zwei aufeinander folgende Pakete x42 und x43 sind in den Positionen 2 – 64 immer identisch.</w:t>
       </w:r>
     </w:p>
     <w:p>
+      <w:pPr>
+        <w:pStyle w:val="Listenabsatz"/>
+        <w:numPr>
+          <w:ilvl w:val="0"/>
+          <w:numId w:val="10"/>
+        </w:numPr>
+        <w:ind w:left="357" w:hanging="357"/>
+        <w:jc w:val="both"/>
+        <w:rPr>
+          <w:rStyle w:val="Fett"/>
+          <w:b w:val="0"/>
+          <w:bCs w:val="0"/>
+          <w:color w:val="000000" w:themeColor="text1"/>
+        </w:rPr>
+      </w:pPr>
       <w:r>
+        <w:rPr>
+          <w:rStyle w:val="Fett"/>
+          <w:b w:val="0"/>
+          <w:bCs w:val="0"/>
+          <w:color w:val="000000" w:themeColor="text1"/>
+        </w:rPr>
+        <w:t>Die Sequenz von Byte Nr. 50 – 55 ändert sich von einer Session zur nächsten, ist infolge aber bei allen 42er und 43er Paketen einer Session identisch.</w:t>
+      </w:r>
+    </w:p>
+    <w:p>
+      <w:pPr>
+        <w:pStyle w:val="Listenabsatz"/>
+        <w:numPr>
+          <w:ilvl w:val="0"/>
+          <w:numId w:val="10"/>
+        </w:numPr>
+        <w:ind w:left="357" w:hanging="357"/>
+        <w:jc w:val="both"/>
+        <w:rPr>
+          <w:rStyle w:val="Fett"/>
+          <w:b w:val="0"/>
+          <w:bCs w:val="0"/>
+          <w:color w:val="000000" w:themeColor="text1"/>
+        </w:rPr>
+      </w:pPr>
+      <w:r>
+        <w:rPr>
+          <w:rStyle w:val="Fett"/>
+          <w:b w:val="0"/>
+          <w:bCs w:val="0"/>
+          <w:color w:val="000000" w:themeColor="text1"/>
+        </w:rPr>
+        <w:t>Die Werte der Bytes Nr. 50 und 51 sind identisch mit den Positionen 6 und 7 im Paket Nr. 32 sowie mit den Positionen 46 und 47 und den Positionen 54 und 55 in Paket Nr. 33.</w:t>
+      </w:r>
+    </w:p>
+    <w:p>
+      <w:pPr>
+        <w:rPr>
+          <w:rStyle w:val="Fett"/>
+        </w:rPr>
+      </w:pPr>
+      <w:r>
+        <w:rPr>
+          <w:rStyle w:val="Fett"/>
+        </w:rPr>
         <w:t>Paket Nr. 31:</w:t>
+      </w:r>
+      <w:r>
+        <w:rPr>
+          <w:rStyle w:val="Fett"/>
+        </w:rPr>
+        <w:t xml:space="preserve"> 1 IN-Paket</w:t>
       </w:r>
     </w:p>
     <w:tbl>
@@ -25296,11 +26010,9 @@
             <w:tcW w:w="481" w:type="dxa"/>
           </w:tcPr>
           <w:p>
-            <w:proofErr w:type="spellStart"/>
             <w:r>
               <w:t>fc</w:t>
             </w:r>
-            <w:proofErr w:type="spellEnd"/>
           </w:p>
         </w:tc>
         <w:tc>
@@ -26042,11 +26754,9 @@
             <w:tcW w:w="480" w:type="dxa"/>
           </w:tcPr>
           <w:p>
-            <w:proofErr w:type="spellStart"/>
             <w:r>
               <w:t>ac</w:t>
             </w:r>
-            <w:proofErr w:type="spellEnd"/>
           </w:p>
         </w:tc>
         <w:tc>
@@ -26082,6 +26792,7 @@
         <w:tc>
           <w:tcPr>
             <w:tcW w:w="481" w:type="dxa"/>
+            <w:shd w:val="clear" w:color="auto" w:fill="F2CEED" w:themeFill="accent5" w:themeFillTint="33"/>
           </w:tcPr>
           <w:p>
             <w:r>
@@ -26092,6 +26803,7 @@
         <w:tc>
           <w:tcPr>
             <w:tcW w:w="481" w:type="dxa"/>
+            <w:shd w:val="clear" w:color="auto" w:fill="F2CEED" w:themeFill="accent5" w:themeFillTint="33"/>
           </w:tcPr>
           <w:p>
             <w:r>
@@ -26102,6 +26814,7 @@
         <w:tc>
           <w:tcPr>
             <w:tcW w:w="481" w:type="dxa"/>
+            <w:shd w:val="clear" w:color="auto" w:fill="F2CEED" w:themeFill="accent5" w:themeFillTint="33"/>
           </w:tcPr>
           <w:p>
             <w:r>
@@ -26112,6 +26825,7 @@
         <w:tc>
           <w:tcPr>
             <w:tcW w:w="481" w:type="dxa"/>
+            <w:shd w:val="clear" w:color="auto" w:fill="F2CEED" w:themeFill="accent5" w:themeFillTint="33"/>
           </w:tcPr>
           <w:p>
             <w:r>
@@ -26134,11 +26848,9 @@
             <w:tcW w:w="481" w:type="dxa"/>
           </w:tcPr>
           <w:p>
-            <w:proofErr w:type="spellStart"/>
             <w:r>
               <w:t>ea</w:t>
             </w:r>
-            <w:proofErr w:type="spellEnd"/>
           </w:p>
         </w:tc>
         <w:tc>
@@ -26184,26 +26896,7 @@
         <w:tc>
           <w:tcPr>
             <w:tcW w:w="481" w:type="dxa"/>
-          </w:tcPr>
-          <w:p>
-            <w:r>
-              <w:t>b3</w:t>
-            </w:r>
-          </w:p>
-        </w:tc>
-        <w:tc>
-          <w:tcPr>
-            <w:tcW w:w="481" w:type="dxa"/>
-          </w:tcPr>
-          <w:p>
-            <w:r>
-              <w:t>76</w:t>
-            </w:r>
-          </w:p>
-        </w:tc>
-        <w:tc>
-          <w:tcPr>
-            <w:tcW w:w="481" w:type="dxa"/>
+            <w:shd w:val="clear" w:color="auto" w:fill="00FFFF"/>
           </w:tcPr>
           <w:p>
             <w:r>
@@ -26214,6 +26907,7 @@
         <w:tc>
           <w:tcPr>
             <w:tcW w:w="481" w:type="dxa"/>
+            <w:shd w:val="clear" w:color="auto" w:fill="00FFFF"/>
           </w:tcPr>
           <w:p>
             <w:r>
@@ -26246,11 +26940,29 @@
             <w:tcW w:w="481" w:type="dxa"/>
           </w:tcPr>
           <w:p>
-            <w:proofErr w:type="spellStart"/>
+            <w:r>
+              <w:t>xx</w:t>
+            </w:r>
+          </w:p>
+        </w:tc>
+        <w:tc>
+          <w:tcPr>
+            <w:tcW w:w="481" w:type="dxa"/>
+          </w:tcPr>
+          <w:p>
+            <w:r>
+              <w:t>xx</w:t>
+            </w:r>
+          </w:p>
+        </w:tc>
+        <w:tc>
+          <w:tcPr>
+            <w:tcW w:w="481" w:type="dxa"/>
+          </w:tcPr>
+          <w:p>
             <w:r>
               <w:t>fe</w:t>
             </w:r>
-            <w:proofErr w:type="spellEnd"/>
           </w:p>
         </w:tc>
         <w:tc>
@@ -26298,11 +27010,9 @@
             <w:tcW w:w="481" w:type="dxa"/>
           </w:tcPr>
           <w:p>
-            <w:proofErr w:type="spellStart"/>
             <w:r>
               <w:t>ea</w:t>
             </w:r>
-            <w:proofErr w:type="spellEnd"/>
           </w:p>
         </w:tc>
         <w:tc>
@@ -26339,15 +27049,21 @@
     </w:tbl>
     <w:p>
       <w:pPr>
-        <w:spacing w:before="120"/>
+        <w:rPr>
+          <w:rStyle w:val="Fett"/>
+        </w:rPr>
       </w:pPr>
       <w:r>
-        <w:t>1 IN-Paket</w:t>
+        <w:rPr>
+          <w:rStyle w:val="Fett"/>
+        </w:rPr>
+        <w:t>Paket Nr. 32:</w:t>
       </w:r>
-    </w:p>
-    <w:p>
       <w:r>
-        <w:t>Paket Nr. 32:</w:t>
+        <w:rPr>
+          <w:rStyle w:val="Fett"/>
+        </w:rPr>
+        <w:t xml:space="preserve"> 1 IN-Paket</w:t>
       </w:r>
     </w:p>
     <w:tbl>
@@ -27092,26 +27808,7 @@
         <w:tc>
           <w:tcPr>
             <w:tcW w:w="481" w:type="dxa"/>
-          </w:tcPr>
-          <w:p>
-            <w:r>
-              <w:t>b3</w:t>
-            </w:r>
-          </w:p>
-        </w:tc>
-        <w:tc>
-          <w:tcPr>
-            <w:tcW w:w="481" w:type="dxa"/>
-          </w:tcPr>
-          <w:p>
-            <w:r>
-              <w:t>76</w:t>
-            </w:r>
-          </w:p>
-        </w:tc>
-        <w:tc>
-          <w:tcPr>
-            <w:tcW w:w="481" w:type="dxa"/>
+            <w:shd w:val="clear" w:color="auto" w:fill="00FFFF"/>
           </w:tcPr>
           <w:p>
             <w:r>
@@ -27122,6 +27819,7 @@
         <w:tc>
           <w:tcPr>
             <w:tcW w:w="481" w:type="dxa"/>
+            <w:shd w:val="clear" w:color="auto" w:fill="00FFFF"/>
           </w:tcPr>
           <w:p>
             <w:r>
@@ -27165,6 +27863,26 @@
           </w:tcPr>
           <w:p>
             <w:r>
+              <w:t>xx</w:t>
+            </w:r>
+          </w:p>
+        </w:tc>
+        <w:tc>
+          <w:tcPr>
+            <w:tcW w:w="481" w:type="dxa"/>
+          </w:tcPr>
+          <w:p>
+            <w:r>
+              <w:t>xx</w:t>
+            </w:r>
+          </w:p>
+        </w:tc>
+        <w:tc>
+          <w:tcPr>
+            <w:tcW w:w="481" w:type="dxa"/>
+          </w:tcPr>
+          <w:p>
+            <w:r>
               <w:t>08</w:t>
             </w:r>
           </w:p>
@@ -27252,20 +27970,21 @@
         <w:tc>
           <w:tcPr>
             <w:tcW w:w="481" w:type="dxa"/>
-          </w:tcPr>
-          <w:p>
-            <w:r>
-              <w:t>0c</w:t>
-            </w:r>
-          </w:p>
-        </w:tc>
-        <w:tc>
-          <w:tcPr>
-            <w:tcW w:w="481" w:type="dxa"/>
-          </w:tcPr>
-          <w:p>
-            <w:r>
-              <w:t>77</w:t>
+            <w:shd w:val="clear" w:color="auto" w:fill="92D050"/>
+          </w:tcPr>
+          <w:p>
+            <w:r>
+              <w:t>xx</w:t>
+            </w:r>
+          </w:p>
+        </w:tc>
+        <w:tc>
+          <w:tcPr>
+            <w:tcW w:w="481" w:type="dxa"/>
+          </w:tcPr>
+          <w:p>
+            <w:r>
+              <w:t>xx</w:t>
             </w:r>
           </w:p>
         </w:tc>
@@ -28298,11 +29017,9 @@
             <w:tcW w:w="481" w:type="dxa"/>
           </w:tcPr>
           <w:p>
-            <w:proofErr w:type="spellStart"/>
             <w:r>
               <w:t>fc</w:t>
             </w:r>
-            <w:proofErr w:type="spellEnd"/>
           </w:p>
         </w:tc>
         <w:tc>
@@ -28329,15 +29046,21 @@
     </w:tbl>
     <w:p>
       <w:pPr>
-        <w:spacing w:before="120"/>
+        <w:rPr>
+          <w:rStyle w:val="Fett"/>
+        </w:rPr>
       </w:pPr>
       <w:r>
-        <w:t>1 IN-Paket</w:t>
+        <w:rPr>
+          <w:rStyle w:val="Fett"/>
+        </w:rPr>
+        <w:t>Paket Nr. 33:</w:t>
       </w:r>
-    </w:p>
-    <w:p>
       <w:r>
-        <w:t>Paket Nr. 33:</w:t>
+        <w:rPr>
+          <w:rStyle w:val="Fett"/>
+        </w:rPr>
+        <w:t xml:space="preserve"> 56 IN-Pakete</w:t>
       </w:r>
     </w:p>
     <w:tbl>
@@ -28403,6 +29126,7 @@
                 <w:b/>
                 <w:bCs/>
               </w:rPr>
+              <w:lastRenderedPageBreak/>
               <w:t>1</w:t>
             </w:r>
           </w:p>
@@ -29082,10 +29806,11 @@
         <w:tc>
           <w:tcPr>
             <w:tcW w:w="481" w:type="dxa"/>
-          </w:tcPr>
-          <w:p>
-            <w:r>
-              <w:t>4d</w:t>
+            <w:shd w:val="clear" w:color="auto" w:fill="FF00FF"/>
+          </w:tcPr>
+          <w:p>
+            <w:r>
+              <w:t>xx</w:t>
             </w:r>
           </w:p>
         </w:tc>
@@ -29122,10 +29847,11 @@
         <w:tc>
           <w:tcPr>
             <w:tcW w:w="481" w:type="dxa"/>
-          </w:tcPr>
-          <w:p>
-            <w:r>
-              <w:t>4f</w:t>
+            <w:shd w:val="clear" w:color="auto" w:fill="FFFF00"/>
+          </w:tcPr>
+          <w:p>
+            <w:r>
+              <w:t>xx</w:t>
             </w:r>
           </w:p>
         </w:tc>
@@ -29194,11 +29920,9 @@
             <w:tcW w:w="481" w:type="dxa"/>
           </w:tcPr>
           <w:p>
-            <w:proofErr w:type="spellStart"/>
             <w:r>
               <w:t>ea</w:t>
             </w:r>
-            <w:proofErr w:type="spellEnd"/>
           </w:p>
         </w:tc>
         <w:tc>
@@ -29316,11 +30040,9 @@
             <w:tcW w:w="481" w:type="dxa"/>
           </w:tcPr>
           <w:p>
-            <w:proofErr w:type="spellStart"/>
             <w:r>
               <w:t>ea</w:t>
             </w:r>
-            <w:proofErr w:type="spellEnd"/>
           </w:p>
         </w:tc>
         <w:tc>
@@ -30002,11 +30724,9 @@
             <w:tcW w:w="480" w:type="dxa"/>
           </w:tcPr>
           <w:p>
-            <w:proofErr w:type="spellStart"/>
             <w:r>
               <w:t>ea</w:t>
             </w:r>
-            <w:proofErr w:type="spellEnd"/>
           </w:p>
         </w:tc>
         <w:tc>
@@ -30086,11 +30806,9 @@
             <w:tcW w:w="481" w:type="dxa"/>
           </w:tcPr>
           <w:p>
-            <w:proofErr w:type="spellStart"/>
             <w:r>
               <w:t>ea</w:t>
             </w:r>
-            <w:proofErr w:type="spellEnd"/>
           </w:p>
         </w:tc>
         <w:tc>
@@ -30136,20 +30854,22 @@
         <w:tc>
           <w:tcPr>
             <w:tcW w:w="481" w:type="dxa"/>
-          </w:tcPr>
-          <w:p>
-            <w:r>
-              <w:t>b3</w:t>
-            </w:r>
-          </w:p>
-        </w:tc>
-        <w:tc>
-          <w:tcPr>
-            <w:tcW w:w="481" w:type="dxa"/>
-          </w:tcPr>
-          <w:p>
-            <w:r>
-              <w:t>76</w:t>
+            <w:shd w:val="clear" w:color="auto" w:fill="00FFFF"/>
+          </w:tcPr>
+          <w:p>
+            <w:r>
+              <w:t>xx</w:t>
+            </w:r>
+          </w:p>
+        </w:tc>
+        <w:tc>
+          <w:tcPr>
+            <w:tcW w:w="481" w:type="dxa"/>
+            <w:shd w:val="clear" w:color="auto" w:fill="00FFFF"/>
+          </w:tcPr>
+          <w:p>
+            <w:r>
+              <w:t>xx</w:t>
             </w:r>
           </w:p>
         </w:tc>
@@ -30216,20 +30936,22 @@
         <w:tc>
           <w:tcPr>
             <w:tcW w:w="481" w:type="dxa"/>
-          </w:tcPr>
-          <w:p>
-            <w:r>
-              <w:t>b3</w:t>
-            </w:r>
-          </w:p>
-        </w:tc>
-        <w:tc>
-          <w:tcPr>
-            <w:tcW w:w="481" w:type="dxa"/>
-          </w:tcPr>
-          <w:p>
-            <w:r>
-              <w:t>76</w:t>
+            <w:shd w:val="clear" w:color="auto" w:fill="00FFFF"/>
+          </w:tcPr>
+          <w:p>
+            <w:r>
+              <w:t>xx</w:t>
+            </w:r>
+          </w:p>
+        </w:tc>
+        <w:tc>
+          <w:tcPr>
+            <w:tcW w:w="481" w:type="dxa"/>
+            <w:shd w:val="clear" w:color="auto" w:fill="00FFFF"/>
+          </w:tcPr>
+          <w:p>
+            <w:r>
+              <w:t>xx</w:t>
             </w:r>
           </w:p>
         </w:tc>
@@ -30325,26 +31047,10 @@
         </w:tc>
       </w:tr>
     </w:tbl>
-    <w:p>
-      <w:pPr>
-        <w:spacing w:before="120"/>
-      </w:pPr>
-      <w:r>
-        <w:t>56 IN-Pakete</w:t>
-      </w:r>
-    </w:p>
     <w:p/>
     <w:p>
       <w:r>
-        <w:t xml:space="preserve">Es gibt folgende </w:t>
-      </w:r>
-      <w:proofErr w:type="spellStart"/>
-      <w:r>
-        <w:t>Opcodes</w:t>
-      </w:r>
-      <w:proofErr w:type="spellEnd"/>
-      <w:r>
-        <w:t>:</w:t>
+        <w:t>Es gibt folgende Opcodes:</w:t>
       </w:r>
     </w:p>
     <w:p>
@@ -30360,7 +31066,6 @@
     </w:p>
     <w:p>
       <w:r>
-        <w:lastRenderedPageBreak/>
         <w:t xml:space="preserve">04 </w:t>
       </w:r>
       <w:r>
@@ -30420,15 +31125,7 @@
         <w:sym w:font="Wingdings" w:char="F0E0"/>
       </w:r>
       <w:r>
-        <w:t xml:space="preserve"> 405 </w:t>
-      </w:r>
-      <w:proofErr w:type="spellStart"/>
-      <w:r>
-        <w:t>nm</w:t>
-      </w:r>
-      <w:proofErr w:type="spellEnd"/>
-      <w:r>
-        <w:t xml:space="preserve"> LED</w:t>
+        <w:t xml:space="preserve"> 405 nm LED</w:t>
       </w:r>
     </w:p>
     <w:p>
@@ -30439,15 +31136,7 @@
         <w:sym w:font="Wingdings" w:char="F0E0"/>
       </w:r>
       <w:r>
-        <w:t xml:space="preserve"> 500 </w:t>
-      </w:r>
-      <w:proofErr w:type="spellStart"/>
-      <w:r>
-        <w:t>nm</w:t>
-      </w:r>
-      <w:proofErr w:type="spellEnd"/>
-      <w:r>
-        <w:t xml:space="preserve"> LED</w:t>
+        <w:t xml:space="preserve"> 500 nm LED</w:t>
       </w:r>
     </w:p>
     <w:p>
@@ -30458,31 +31147,13 @@
         <w:sym w:font="Wingdings" w:char="F0E0"/>
       </w:r>
       <w:r>
-        <w:t xml:space="preserve"> bestätigt die Strahlungsquelle Weisslicht LED mit 41 01 in Byte </w:t>
+        <w:t xml:space="preserve"> bestätigt</w:t>
       </w:r>
-      <w:proofErr w:type="spellStart"/>
       <w:r>
-        <w:t>Nr</w:t>
+        <w:t xml:space="preserve"> (?)</w:t>
       </w:r>
-      <w:proofErr w:type="spellEnd"/>
       <w:r>
-        <w:t xml:space="preserve"> 1 und 2, wenn Byte Nr. 60 – 64 c0 f2 </w:t>
-      </w:r>
-      <w:proofErr w:type="spellStart"/>
-      <w:r>
-        <w:t>fc</w:t>
-      </w:r>
-      <w:proofErr w:type="spellEnd"/>
-      <w:r>
-        <w:t xml:space="preserve"> ff </w:t>
-      </w:r>
-      <w:proofErr w:type="spellStart"/>
-      <w:r>
-        <w:t>ff</w:t>
-      </w:r>
-      <w:proofErr w:type="spellEnd"/>
-      <w:r>
-        <w:t xml:space="preserve"> ist.</w:t>
+        <w:t xml:space="preserve"> die Strahlungsquelle Weisslicht LED mit 41 01 in Byte Nr 1 und 2, wenn Byte Nr. 60 – 64 c0 f2 fc ff ff ist.</w:t>
       </w:r>
     </w:p>
     <w:p>
@@ -30493,39 +31164,16 @@
         <w:sym w:font="Wingdings" w:char="F0E0"/>
       </w:r>
       <w:r>
-        <w:t xml:space="preserve"> bestätigt die Strahlungsquelle 405 </w:t>
+        <w:t xml:space="preserve"> bestätigt</w:t>
       </w:r>
-      <w:proofErr w:type="spellStart"/>
       <w:r>
-        <w:t>nm</w:t>
+        <w:t xml:space="preserve"> </w:t>
       </w:r>
-      <w:proofErr w:type="spellEnd"/>
       <w:r>
-        <w:t xml:space="preserve"> LED mit 42 01 in Byte </w:t>
+        <w:t>(?)</w:t>
       </w:r>
-      <w:proofErr w:type="spellStart"/>
       <w:r>
-        <w:t>Nr</w:t>
-      </w:r>
-      <w:proofErr w:type="spellEnd"/>
-      <w:r>
-        <w:t xml:space="preserve"> 1 und 2, wenn Byte Nr. 60 – 64 c0 f2 </w:t>
-      </w:r>
-      <w:proofErr w:type="spellStart"/>
-      <w:r>
-        <w:t>fc</w:t>
-      </w:r>
-      <w:proofErr w:type="spellEnd"/>
-      <w:r>
-        <w:t xml:space="preserve"> ff </w:t>
-      </w:r>
-      <w:proofErr w:type="spellStart"/>
-      <w:r>
-        <w:t>ff</w:t>
-      </w:r>
-      <w:proofErr w:type="spellEnd"/>
-      <w:r>
-        <w:t xml:space="preserve"> ist.</w:t>
+        <w:t xml:space="preserve"> die Strahlungsquelle 405 nm LED mit 42 01 in Byte Nr 1 und 2, wenn Byte Nr. 60 – 64 c0 f2 fc ff ff ist.</w:t>
       </w:r>
     </w:p>
     <w:p>
@@ -30536,178 +31184,22 @@
         <w:sym w:font="Wingdings" w:char="F0E0"/>
       </w:r>
       <w:r>
-        <w:t xml:space="preserve"> bestätigt die Strahlungsquelle 500 </w:t>
-      </w:r>
-      <w:proofErr w:type="spellStart"/>
-      <w:r>
-        <w:t>nm</w:t>
-      </w:r>
-      <w:proofErr w:type="spellEnd"/>
-      <w:r>
-        <w:t xml:space="preserve"> LED mit 43 01 in Byte </w:t>
-      </w:r>
-      <w:proofErr w:type="spellStart"/>
-      <w:r>
-        <w:t>Nr</w:t>
-      </w:r>
-      <w:proofErr w:type="spellEnd"/>
-      <w:r>
-        <w:t xml:space="preserve"> 1 und 2, wenn Byte Nr. 60 – 64 c0 f2 </w:t>
-      </w:r>
-      <w:proofErr w:type="spellStart"/>
-      <w:r>
-        <w:t>fc</w:t>
-      </w:r>
-      <w:proofErr w:type="spellEnd"/>
-      <w:r>
-        <w:t xml:space="preserve"> ff </w:t>
-      </w:r>
-      <w:proofErr w:type="spellStart"/>
-      <w:r>
-        <w:t>ff</w:t>
-      </w:r>
-      <w:proofErr w:type="spellEnd"/>
-      <w:r>
-        <w:t xml:space="preserve"> ist.</w:t>
-      </w:r>
-    </w:p>
-    <w:p/>
-    <w:p/>
-    <w:p/>
-    <w:p>
-      <w:r>
-        <w:t xml:space="preserve">Die «Erfassungszeit» beträgt </w:t>
-      </w:r>
-      <w:proofErr w:type="spellStart"/>
-      <w:r>
-        <w:t>default</w:t>
-      </w:r>
-      <w:proofErr w:type="spellEnd"/>
-      <w:r>
-        <w:t xml:space="preserve"> im Betriebsmodus Absorbanz und Transmission 15 </w:t>
-      </w:r>
-      <w:proofErr w:type="spellStart"/>
-      <w:r>
-        <w:t>ms</w:t>
-      </w:r>
-      <w:proofErr w:type="spellEnd"/>
-      <w:r>
-        <w:t xml:space="preserve">, in allen anderen Betriebsmodi beträgt sie 30 </w:t>
-      </w:r>
-      <w:proofErr w:type="spellStart"/>
-      <w:r>
-        <w:t>ms.</w:t>
-      </w:r>
-      <w:proofErr w:type="spellEnd"/>
-      <w:r>
-        <w:t xml:space="preserve"> Tatsächlich beträgt während einer laufenden Messung das Zeitintervall zwischen zwei OUT-Paketen in den Betriebsmodi Absorbanz und Transmission 30 </w:t>
-      </w:r>
-      <w:proofErr w:type="spellStart"/>
-      <w:r>
-        <w:t>ms</w:t>
-      </w:r>
-      <w:proofErr w:type="spellEnd"/>
-      <w:r>
-        <w:t xml:space="preserve">, in den übrigen Betriebsmodi beträgt sie 15 </w:t>
-      </w:r>
-      <w:proofErr w:type="spellStart"/>
-      <w:r>
-        <w:t>ms.</w:t>
-      </w:r>
-      <w:proofErr w:type="spellEnd"/>
-    </w:p>
-    <w:p/>
-    <w:p>
-      <w:r>
-        <w:t>Wörter, die immer wieder auftauchen:</w:t>
-      </w:r>
-    </w:p>
-    <w:p>
-      <w:r>
-        <w:t xml:space="preserve">19 00 </w:t>
-      </w:r>
-      <w:r>
-        <w:sym w:font="Wingdings" w:char="F0E0"/>
+        <w:t xml:space="preserve"> bestätigt</w:t>
       </w:r>
       <w:r>
         <w:t xml:space="preserve"> </w:t>
       </w:r>
       <w:r>
-        <w:t xml:space="preserve">kommt in Paketen mit allen </w:t>
-      </w:r>
-      <w:proofErr w:type="spellStart"/>
-      <w:r>
-        <w:t>Opcodes</w:t>
-      </w:r>
-      <w:proofErr w:type="spellEnd"/>
-      <w:r>
-        <w:t xml:space="preserve"> vor, ausser</w:t>
+        <w:t>(?)</w:t>
       </w:r>
       <w:r>
-        <w:t xml:space="preserve"> in 40er Paketen</w:t>
-      </w:r>
-      <w:r>
-        <w:t xml:space="preserve">, </w:t>
-      </w:r>
-      <w:r>
-        <w:t>wenn Messung oder Ping</w:t>
-      </w:r>
-      <w:r>
-        <w:t xml:space="preserve"> </w:t>
-      </w:r>
-      <w:r>
-        <w:sym w:font="Wingdings" w:char="F0E0"/>
-      </w:r>
-      <w:r>
-        <w:t xml:space="preserve"> Zustandswechsel</w:t>
-      </w:r>
-    </w:p>
-    <w:p>
-      <w:r>
-        <w:t xml:space="preserve">4f 77 </w:t>
-      </w:r>
-      <w:r>
-        <w:sym w:font="Wingdings" w:char="F0E0"/>
-      </w:r>
-      <w:r>
-        <w:t xml:space="preserve"> Paket Nr. 2 (00x) und Nr. 4 (02x); 40er Paketen, die mit einem Zustandswechsel assoziiert sind</w:t>
-      </w:r>
-    </w:p>
-    <w:p>
-      <w:r>
-        <w:t xml:space="preserve">49 77 </w:t>
-      </w:r>
-      <w:r>
-        <w:sym w:font="Wingdings" w:char="F0E0"/>
-      </w:r>
-      <w:r>
-        <w:t xml:space="preserve"> Paket Nr. 2 (00x), Nr. 3 (01x) und Nr. 4 (02x); 41er Pakete, die einen Zustandswechsel einleiten; 04er Pakete, die zugleich auch die Session ID enthalten</w:t>
-      </w:r>
-    </w:p>
-    <w:p>
-      <w:r>
-        <w:t xml:space="preserve">f9 f6 </w:t>
-      </w:r>
-      <w:r>
-        <w:sym w:font="Wingdings" w:char="F0E0"/>
-      </w:r>
-      <w:r>
-        <w:t xml:space="preserve"> kommt vor in Paket Nr. 2, 3 und 4 der Initialisierung, taucht dann wieder in 04er Paketen auf, die mit der Kalibration/</w:t>
-      </w:r>
-      <w:proofErr w:type="spellStart"/>
-      <w:r>
-        <w:t>Rekalibration</w:t>
-      </w:r>
-      <w:proofErr w:type="spellEnd"/>
-      <w:r>
-        <w:t xml:space="preserve"> assoziiert sind</w:t>
+        <w:t xml:space="preserve"> die Strahlungsquelle 500 nm LED mit 43 01 in Byte Nr 1 und 2, wenn Byte Nr. 60 – 64 c0 f2 fc ff ff ist.</w:t>
       </w:r>
     </w:p>
     <w:p/>
-    <w:p/>
     <w:sectPr>
       <w:pgSz w:w="16838" w:h="11906" w:orient="landscape"/>
-      <w:pgMar w:top="720" w:right="720" w:bottom="720" w:left="720" w:header="708" w:footer="708" w:gutter="0"/>
+      <w:pgMar w:top="720" w:right="720" w:bottom="720" w:left="720" w:header="454" w:footer="283" w:gutter="0"/>
       <w:cols w:space="708"/>
       <w:docGrid w:linePitch="360"/>
     </w:sectPr>
@@ -30715,9 +31207,285 @@
 </w:document>
 </file>
 
+<file path=word/endnotes.xml><?xml version="1.0" encoding="utf-8"?>
+<w:endnotes xmlns:wpc="http://schemas.microsoft.com/office/word/2010/wordprocessingCanvas" xmlns:cx="http://schemas.microsoft.com/office/drawing/2014/chartex" xmlns:cx1="http://schemas.microsoft.com/office/drawing/2015/9/8/chartex" xmlns:cx2="http://schemas.microsoft.com/office/drawing/2015/10/21/chartex" xmlns:cx3="http://schemas.microsoft.com/office/drawing/2016/5/9/chartex" xmlns:cx4="http://schemas.microsoft.com/office/drawing/2016/5/10/chartex" xmlns:cx5="http://schemas.microsoft.com/office/drawing/2016/5/11/chartex" xmlns:cx6="http://schemas.microsoft.com/office/drawing/2016/5/12/chartex" xmlns:cx7="http://schemas.microsoft.com/office/drawing/2016/5/13/chartex" xmlns:cx8="http://schemas.microsoft.com/office/drawing/2016/5/14/chartex" xmlns:mc="http://schemas.openxmlformats.org/markup-compatibility/2006" xmlns:aink="http://schemas.microsoft.com/office/drawing/2016/ink" xmlns:am3d="http://schemas.microsoft.com/office/drawing/2017/model3d" xmlns:o="urn:schemas-microsoft-com:office:office" xmlns:oel="http://schemas.microsoft.com/office/2019/extlst" xmlns:r="http://schemas.openxmlformats.org/officeDocument/2006/relationships" xmlns:m="http://schemas.openxmlformats.org/officeDocument/2006/math" xmlns:v="urn:schemas-microsoft-com:vml" xmlns:wp14="http://schemas.microsoft.com/office/word/2010/wordprocessingDrawing" xmlns:wp="http://schemas.openxmlformats.org/drawingml/2006/wordprocessingDrawing" xmlns:w10="urn:schemas-microsoft-com:office:word" xmlns:w="http://schemas.openxmlformats.org/wordprocessingml/2006/main" xmlns:w14="http://schemas.microsoft.com/office/word/2010/wordml" xmlns:w15="http://schemas.microsoft.com/office/word/2012/wordml" xmlns:w16cex="http://schemas.microsoft.com/office/word/2018/wordml/cex" xmlns:w16cid="http://schemas.microsoft.com/office/word/2016/wordml/cid" xmlns:w16="http://schemas.microsoft.com/office/word/2018/wordml" xmlns:w16du="http://schemas.microsoft.com/office/word/2023/wordml/word16du" xmlns:w16sdtdh="http://schemas.microsoft.com/office/word/2020/wordml/sdtdatahash" xmlns:w16sdtfl="http://schemas.microsoft.com/office/word/2024/wordml/sdtformatlock" xmlns:w16se="http://schemas.microsoft.com/office/word/2015/wordml/symex" xmlns:wpg="http://schemas.microsoft.com/office/word/2010/wordprocessingGroup" xmlns:wpi="http://schemas.microsoft.com/office/word/2010/wordprocessingInk" xmlns:wne="http://schemas.microsoft.com/office/word/2006/wordml" xmlns:wps="http://schemas.microsoft.com/office/word/2010/wordprocessingShape" mc:Ignorable="w14 w15 w16se w16cid w16 w16cex w16sdtdh w16sdtfl w16du wp14">
+  <w:endnote w:type="separator" w:id="-1">
+    <w:p>
+      <w:pPr>
+        <w:spacing w:after="0" w:line="240" w:lineRule="auto"/>
+      </w:pPr>
+      <w:r>
+        <w:separator/>
+      </w:r>
+    </w:p>
+  </w:endnote>
+  <w:endnote w:type="continuationSeparator" w:id="0">
+    <w:p>
+      <w:pPr>
+        <w:spacing w:after="0" w:line="240" w:lineRule="auto"/>
+      </w:pPr>
+      <w:r>
+        <w:continuationSeparator/>
+      </w:r>
+    </w:p>
+  </w:endnote>
+</w:endnotes>
+</file>
+
+<file path=word/footnotes.xml><?xml version="1.0" encoding="utf-8"?>
+<w:footnotes xmlns:wpc="http://schemas.microsoft.com/office/word/2010/wordprocessingCanvas" xmlns:cx="http://schemas.microsoft.com/office/drawing/2014/chartex" xmlns:cx1="http://schemas.microsoft.com/office/drawing/2015/9/8/chartex" xmlns:cx2="http://schemas.microsoft.com/office/drawing/2015/10/21/chartex" xmlns:cx3="http://schemas.microsoft.com/office/drawing/2016/5/9/chartex" xmlns:cx4="http://schemas.microsoft.com/office/drawing/2016/5/10/chartex" xmlns:cx5="http://schemas.microsoft.com/office/drawing/2016/5/11/chartex" xmlns:cx6="http://schemas.microsoft.com/office/drawing/2016/5/12/chartex" xmlns:cx7="http://schemas.microsoft.com/office/drawing/2016/5/13/chartex" xmlns:cx8="http://schemas.microsoft.com/office/drawing/2016/5/14/chartex" xmlns:mc="http://schemas.openxmlformats.org/markup-compatibility/2006" xmlns:aink="http://schemas.microsoft.com/office/drawing/2016/ink" xmlns:am3d="http://schemas.microsoft.com/office/drawing/2017/model3d" xmlns:o="urn:schemas-microsoft-com:office:office" xmlns:oel="http://schemas.microsoft.com/office/2019/extlst" xmlns:r="http://schemas.openxmlformats.org/officeDocument/2006/relationships" xmlns:m="http://schemas.openxmlformats.org/officeDocument/2006/math" xmlns:v="urn:schemas-microsoft-com:vml" xmlns:wp14="http://schemas.microsoft.com/office/word/2010/wordprocessingDrawing" xmlns:wp="http://schemas.openxmlformats.org/drawingml/2006/wordprocessingDrawing" xmlns:w10="urn:schemas-microsoft-com:office:word" xmlns:w="http://schemas.openxmlformats.org/wordprocessingml/2006/main" xmlns:w14="http://schemas.microsoft.com/office/word/2010/wordml" xmlns:w15="http://schemas.microsoft.com/office/word/2012/wordml" xmlns:w16cex="http://schemas.microsoft.com/office/word/2018/wordml/cex" xmlns:w16cid="http://schemas.microsoft.com/office/word/2016/wordml/cid" xmlns:w16="http://schemas.microsoft.com/office/word/2018/wordml" xmlns:w16du="http://schemas.microsoft.com/office/word/2023/wordml/word16du" xmlns:w16sdtdh="http://schemas.microsoft.com/office/word/2020/wordml/sdtdatahash" xmlns:w16sdtfl="http://schemas.microsoft.com/office/word/2024/wordml/sdtformatlock" xmlns:w16se="http://schemas.microsoft.com/office/word/2015/wordml/symex" xmlns:wpg="http://schemas.microsoft.com/office/word/2010/wordprocessingGroup" xmlns:wpi="http://schemas.microsoft.com/office/word/2010/wordprocessingInk" xmlns:wne="http://schemas.microsoft.com/office/word/2006/wordml" xmlns:wps="http://schemas.microsoft.com/office/word/2010/wordprocessingShape" mc:Ignorable="w14 w15 w16se w16cid w16 w16cex w16sdtdh w16sdtfl w16du wp14">
+  <w:footnote w:type="separator" w:id="-1">
+    <w:p>
+      <w:pPr>
+        <w:spacing w:after="0" w:line="240" w:lineRule="auto"/>
+      </w:pPr>
+      <w:r>
+        <w:separator/>
+      </w:r>
+    </w:p>
+  </w:footnote>
+  <w:footnote w:type="continuationSeparator" w:id="0">
+    <w:p>
+      <w:pPr>
+        <w:spacing w:after="0" w:line="240" w:lineRule="auto"/>
+      </w:pPr>
+      <w:r>
+        <w:continuationSeparator/>
+      </w:r>
+    </w:p>
+  </w:footnote>
+</w:footnotes>
+</file>
+
 <file path=word/numbering.xml><?xml version="1.0" encoding="utf-8"?>
 <w:numbering xmlns:wpc="http://schemas.microsoft.com/office/word/2010/wordprocessingCanvas" xmlns:cx="http://schemas.microsoft.com/office/drawing/2014/chartex" xmlns:cx1="http://schemas.microsoft.com/office/drawing/2015/9/8/chartex" xmlns:cx2="http://schemas.microsoft.com/office/drawing/2015/10/21/chartex" xmlns:cx3="http://schemas.microsoft.com/office/drawing/2016/5/9/chartex" xmlns:cx4="http://schemas.microsoft.com/office/drawing/2016/5/10/chartex" xmlns:cx5="http://schemas.microsoft.com/office/drawing/2016/5/11/chartex" xmlns:cx6="http://schemas.microsoft.com/office/drawing/2016/5/12/chartex" xmlns:cx7="http://schemas.microsoft.com/office/drawing/2016/5/13/chartex" xmlns:cx8="http://schemas.microsoft.com/office/drawing/2016/5/14/chartex" xmlns:mc="http://schemas.openxmlformats.org/markup-compatibility/2006" xmlns:aink="http://schemas.microsoft.com/office/drawing/2016/ink" xmlns:am3d="http://schemas.microsoft.com/office/drawing/2017/model3d" xmlns:o="urn:schemas-microsoft-com:office:office" xmlns:oel="http://schemas.microsoft.com/office/2019/extlst" xmlns:r="http://schemas.openxmlformats.org/officeDocument/2006/relationships" xmlns:m="http://schemas.openxmlformats.org/officeDocument/2006/math" xmlns:v="urn:schemas-microsoft-com:vml" xmlns:wp14="http://schemas.microsoft.com/office/word/2010/wordprocessingDrawing" xmlns:wp="http://schemas.openxmlformats.org/drawingml/2006/wordprocessingDrawing" xmlns:w10="urn:schemas-microsoft-com:office:word" xmlns:w="http://schemas.openxmlformats.org/wordprocessingml/2006/main" xmlns:w14="http://schemas.microsoft.com/office/word/2010/wordml" xmlns:w15="http://schemas.microsoft.com/office/word/2012/wordml" xmlns:w16cex="http://schemas.microsoft.com/office/word/2018/wordml/cex" xmlns:w16cid="http://schemas.microsoft.com/office/word/2016/wordml/cid" xmlns:w16="http://schemas.microsoft.com/office/word/2018/wordml" xmlns:w16du="http://schemas.microsoft.com/office/word/2023/wordml/word16du" xmlns:w16sdtdh="http://schemas.microsoft.com/office/word/2020/wordml/sdtdatahash" xmlns:w16sdtfl="http://schemas.microsoft.com/office/word/2024/wordml/sdtformatlock" xmlns:w16se="http://schemas.microsoft.com/office/word/2015/wordml/symex" xmlns:wpg="http://schemas.microsoft.com/office/word/2010/wordprocessingGroup" xmlns:wpi="http://schemas.microsoft.com/office/word/2010/wordprocessingInk" xmlns:wne="http://schemas.microsoft.com/office/word/2006/wordml" xmlns:wps="http://schemas.microsoft.com/office/word/2010/wordprocessingShape" mc:Ignorable="w14 w15 w16se w16cid w16 w16cex w16sdtdh w16sdtfl w16du wp14">
   <w:abstractNum w:abstractNumId="0" w15:restartNumberingAfterBreak="0">
+    <w:nsid w:val="182B4E90"/>
+    <w:multiLevelType w:val="hybridMultilevel"/>
+    <w:tmpl w:val="670812A0"/>
+    <w:lvl w:ilvl="0" w:tplc="08070001">
+      <w:start w:val="1"/>
+      <w:numFmt w:val="bullet"/>
+      <w:lvlText w:val=""/>
+      <w:lvlJc w:val="left"/>
+      <w:pPr>
+        <w:ind w:left="360" w:hanging="360"/>
+      </w:pPr>
+      <w:rPr>
+        <w:rFonts w:ascii="Symbol" w:hAnsi="Symbol" w:hint="default"/>
+      </w:rPr>
+    </w:lvl>
+    <w:lvl w:ilvl="1" w:tplc="08070003" w:tentative="1">
+      <w:start w:val="1"/>
+      <w:numFmt w:val="bullet"/>
+      <w:lvlText w:val="o"/>
+      <w:lvlJc w:val="left"/>
+      <w:pPr>
+        <w:ind w:left="1080" w:hanging="360"/>
+      </w:pPr>
+      <w:rPr>
+        <w:rFonts w:ascii="Courier New" w:hAnsi="Courier New" w:cs="Courier New" w:hint="default"/>
+      </w:rPr>
+    </w:lvl>
+    <w:lvl w:ilvl="2" w:tplc="08070005" w:tentative="1">
+      <w:start w:val="1"/>
+      <w:numFmt w:val="bullet"/>
+      <w:lvlText w:val=""/>
+      <w:lvlJc w:val="left"/>
+      <w:pPr>
+        <w:ind w:left="1800" w:hanging="360"/>
+      </w:pPr>
+      <w:rPr>
+        <w:rFonts w:ascii="Wingdings" w:hAnsi="Wingdings" w:hint="default"/>
+      </w:rPr>
+    </w:lvl>
+    <w:lvl w:ilvl="3" w:tplc="08070001" w:tentative="1">
+      <w:start w:val="1"/>
+      <w:numFmt w:val="bullet"/>
+      <w:lvlText w:val=""/>
+      <w:lvlJc w:val="left"/>
+      <w:pPr>
+        <w:ind w:left="2520" w:hanging="360"/>
+      </w:pPr>
+      <w:rPr>
+        <w:rFonts w:ascii="Symbol" w:hAnsi="Symbol" w:hint="default"/>
+      </w:rPr>
+    </w:lvl>
+    <w:lvl w:ilvl="4" w:tplc="08070003" w:tentative="1">
+      <w:start w:val="1"/>
+      <w:numFmt w:val="bullet"/>
+      <w:lvlText w:val="o"/>
+      <w:lvlJc w:val="left"/>
+      <w:pPr>
+        <w:ind w:left="3240" w:hanging="360"/>
+      </w:pPr>
+      <w:rPr>
+        <w:rFonts w:ascii="Courier New" w:hAnsi="Courier New" w:cs="Courier New" w:hint="default"/>
+      </w:rPr>
+    </w:lvl>
+    <w:lvl w:ilvl="5" w:tplc="08070005" w:tentative="1">
+      <w:start w:val="1"/>
+      <w:numFmt w:val="bullet"/>
+      <w:lvlText w:val=""/>
+      <w:lvlJc w:val="left"/>
+      <w:pPr>
+        <w:ind w:left="3960" w:hanging="360"/>
+      </w:pPr>
+      <w:rPr>
+        <w:rFonts w:ascii="Wingdings" w:hAnsi="Wingdings" w:hint="default"/>
+      </w:rPr>
+    </w:lvl>
+    <w:lvl w:ilvl="6" w:tplc="08070001" w:tentative="1">
+      <w:start w:val="1"/>
+      <w:numFmt w:val="bullet"/>
+      <w:lvlText w:val=""/>
+      <w:lvlJc w:val="left"/>
+      <w:pPr>
+        <w:ind w:left="4680" w:hanging="360"/>
+      </w:pPr>
+      <w:rPr>
+        <w:rFonts w:ascii="Symbol" w:hAnsi="Symbol" w:hint="default"/>
+      </w:rPr>
+    </w:lvl>
+    <w:lvl w:ilvl="7" w:tplc="08070003" w:tentative="1">
+      <w:start w:val="1"/>
+      <w:numFmt w:val="bullet"/>
+      <w:lvlText w:val="o"/>
+      <w:lvlJc w:val="left"/>
+      <w:pPr>
+        <w:ind w:left="5400" w:hanging="360"/>
+      </w:pPr>
+      <w:rPr>
+        <w:rFonts w:ascii="Courier New" w:hAnsi="Courier New" w:cs="Courier New" w:hint="default"/>
+      </w:rPr>
+    </w:lvl>
+    <w:lvl w:ilvl="8" w:tplc="08070005" w:tentative="1">
+      <w:start w:val="1"/>
+      <w:numFmt w:val="bullet"/>
+      <w:lvlText w:val=""/>
+      <w:lvlJc w:val="left"/>
+      <w:pPr>
+        <w:ind w:left="6120" w:hanging="360"/>
+      </w:pPr>
+      <w:rPr>
+        <w:rFonts w:ascii="Wingdings" w:hAnsi="Wingdings" w:hint="default"/>
+      </w:rPr>
+    </w:lvl>
+  </w:abstractNum>
+  <w:abstractNum w:abstractNumId="1" w15:restartNumberingAfterBreak="0">
+    <w:nsid w:val="1D1E4588"/>
+    <w:multiLevelType w:val="hybridMultilevel"/>
+    <w:tmpl w:val="4B0EA4B0"/>
+    <w:lvl w:ilvl="0" w:tplc="08070001">
+      <w:start w:val="1"/>
+      <w:numFmt w:val="bullet"/>
+      <w:lvlText w:val=""/>
+      <w:lvlJc w:val="left"/>
+      <w:pPr>
+        <w:ind w:left="360" w:hanging="360"/>
+      </w:pPr>
+      <w:rPr>
+        <w:rFonts w:ascii="Symbol" w:hAnsi="Symbol" w:hint="default"/>
+      </w:rPr>
+    </w:lvl>
+    <w:lvl w:ilvl="1" w:tplc="08070003">
+      <w:start w:val="1"/>
+      <w:numFmt w:val="bullet"/>
+      <w:lvlText w:val="o"/>
+      <w:lvlJc w:val="left"/>
+      <w:pPr>
+        <w:ind w:left="1080" w:hanging="360"/>
+      </w:pPr>
+      <w:rPr>
+        <w:rFonts w:ascii="Courier New" w:hAnsi="Courier New" w:cs="Courier New" w:hint="default"/>
+      </w:rPr>
+    </w:lvl>
+    <w:lvl w:ilvl="2" w:tplc="08070005" w:tentative="1">
+      <w:start w:val="1"/>
+      <w:numFmt w:val="bullet"/>
+      <w:lvlText w:val=""/>
+      <w:lvlJc w:val="left"/>
+      <w:pPr>
+        <w:ind w:left="1800" w:hanging="360"/>
+      </w:pPr>
+      <w:rPr>
+        <w:rFonts w:ascii="Wingdings" w:hAnsi="Wingdings" w:hint="default"/>
+      </w:rPr>
+    </w:lvl>
+    <w:lvl w:ilvl="3" w:tplc="08070001" w:tentative="1">
+      <w:start w:val="1"/>
+      <w:numFmt w:val="bullet"/>
+      <w:lvlText w:val=""/>
+      <w:lvlJc w:val="left"/>
+      <w:pPr>
+        <w:ind w:left="2520" w:hanging="360"/>
+      </w:pPr>
+      <w:rPr>
+        <w:rFonts w:ascii="Symbol" w:hAnsi="Symbol" w:hint="default"/>
+      </w:rPr>
+    </w:lvl>
+    <w:lvl w:ilvl="4" w:tplc="08070003" w:tentative="1">
+      <w:start w:val="1"/>
+      <w:numFmt w:val="bullet"/>
+      <w:lvlText w:val="o"/>
+      <w:lvlJc w:val="left"/>
+      <w:pPr>
+        <w:ind w:left="3240" w:hanging="360"/>
+      </w:pPr>
+      <w:rPr>
+        <w:rFonts w:ascii="Courier New" w:hAnsi="Courier New" w:cs="Courier New" w:hint="default"/>
+      </w:rPr>
+    </w:lvl>
+    <w:lvl w:ilvl="5" w:tplc="08070005" w:tentative="1">
+      <w:start w:val="1"/>
+      <w:numFmt w:val="bullet"/>
+      <w:lvlText w:val=""/>
+      <w:lvlJc w:val="left"/>
+      <w:pPr>
+        <w:ind w:left="3960" w:hanging="360"/>
+      </w:pPr>
+      <w:rPr>
+        <w:rFonts w:ascii="Wingdings" w:hAnsi="Wingdings" w:hint="default"/>
+      </w:rPr>
+    </w:lvl>
+    <w:lvl w:ilvl="6" w:tplc="08070001" w:tentative="1">
+      <w:start w:val="1"/>
+      <w:numFmt w:val="bullet"/>
+      <w:lvlText w:val=""/>
+      <w:lvlJc w:val="left"/>
+      <w:pPr>
+        <w:ind w:left="4680" w:hanging="360"/>
+      </w:pPr>
+      <w:rPr>
+        <w:rFonts w:ascii="Symbol" w:hAnsi="Symbol" w:hint="default"/>
+      </w:rPr>
+    </w:lvl>
+    <w:lvl w:ilvl="7" w:tplc="08070003" w:tentative="1">
+      <w:start w:val="1"/>
+      <w:numFmt w:val="bullet"/>
+      <w:lvlText w:val="o"/>
+      <w:lvlJc w:val="left"/>
+      <w:pPr>
+        <w:ind w:left="5400" w:hanging="360"/>
+      </w:pPr>
+      <w:rPr>
+        <w:rFonts w:ascii="Courier New" w:hAnsi="Courier New" w:cs="Courier New" w:hint="default"/>
+      </w:rPr>
+    </w:lvl>
+    <w:lvl w:ilvl="8" w:tplc="08070005" w:tentative="1">
+      <w:start w:val="1"/>
+      <w:numFmt w:val="bullet"/>
+      <w:lvlText w:val=""/>
+      <w:lvlJc w:val="left"/>
+      <w:pPr>
+        <w:ind w:left="6120" w:hanging="360"/>
+      </w:pPr>
+      <w:rPr>
+        <w:rFonts w:ascii="Wingdings" w:hAnsi="Wingdings" w:hint="default"/>
+      </w:rPr>
+    </w:lvl>
+  </w:abstractNum>
+  <w:abstractNum w:abstractNumId="2" w15:restartNumberingAfterBreak="0">
     <w:nsid w:val="2CA62021"/>
     <w:multiLevelType w:val="hybridMultilevel"/>
     <w:tmpl w:val="9BDA8250"/>
@@ -30830,7 +31598,685 @@
       </w:rPr>
     </w:lvl>
   </w:abstractNum>
-  <w:abstractNum w:abstractNumId="1" w15:restartNumberingAfterBreak="0">
+  <w:abstractNum w:abstractNumId="3" w15:restartNumberingAfterBreak="0">
+    <w:nsid w:val="31DC1218"/>
+    <w:multiLevelType w:val="hybridMultilevel"/>
+    <w:tmpl w:val="46A6C50A"/>
+    <w:lvl w:ilvl="0" w:tplc="08070001">
+      <w:start w:val="1"/>
+      <w:numFmt w:val="bullet"/>
+      <w:lvlText w:val=""/>
+      <w:lvlJc w:val="left"/>
+      <w:pPr>
+        <w:ind w:left="360" w:hanging="360"/>
+      </w:pPr>
+      <w:rPr>
+        <w:rFonts w:ascii="Symbol" w:hAnsi="Symbol" w:hint="default"/>
+      </w:rPr>
+    </w:lvl>
+    <w:lvl w:ilvl="1" w:tplc="08070003" w:tentative="1">
+      <w:start w:val="1"/>
+      <w:numFmt w:val="bullet"/>
+      <w:lvlText w:val="o"/>
+      <w:lvlJc w:val="left"/>
+      <w:pPr>
+        <w:ind w:left="1080" w:hanging="360"/>
+      </w:pPr>
+      <w:rPr>
+        <w:rFonts w:ascii="Courier New" w:hAnsi="Courier New" w:cs="Courier New" w:hint="default"/>
+      </w:rPr>
+    </w:lvl>
+    <w:lvl w:ilvl="2" w:tplc="08070005" w:tentative="1">
+      <w:start w:val="1"/>
+      <w:numFmt w:val="bullet"/>
+      <w:lvlText w:val=""/>
+      <w:lvlJc w:val="left"/>
+      <w:pPr>
+        <w:ind w:left="1800" w:hanging="360"/>
+      </w:pPr>
+      <w:rPr>
+        <w:rFonts w:ascii="Wingdings" w:hAnsi="Wingdings" w:hint="default"/>
+      </w:rPr>
+    </w:lvl>
+    <w:lvl w:ilvl="3" w:tplc="08070001" w:tentative="1">
+      <w:start w:val="1"/>
+      <w:numFmt w:val="bullet"/>
+      <w:lvlText w:val=""/>
+      <w:lvlJc w:val="left"/>
+      <w:pPr>
+        <w:ind w:left="2520" w:hanging="360"/>
+      </w:pPr>
+      <w:rPr>
+        <w:rFonts w:ascii="Symbol" w:hAnsi="Symbol" w:hint="default"/>
+      </w:rPr>
+    </w:lvl>
+    <w:lvl w:ilvl="4" w:tplc="08070003" w:tentative="1">
+      <w:start w:val="1"/>
+      <w:numFmt w:val="bullet"/>
+      <w:lvlText w:val="o"/>
+      <w:lvlJc w:val="left"/>
+      <w:pPr>
+        <w:ind w:left="3240" w:hanging="360"/>
+      </w:pPr>
+      <w:rPr>
+        <w:rFonts w:ascii="Courier New" w:hAnsi="Courier New" w:cs="Courier New" w:hint="default"/>
+      </w:rPr>
+    </w:lvl>
+    <w:lvl w:ilvl="5" w:tplc="08070005" w:tentative="1">
+      <w:start w:val="1"/>
+      <w:numFmt w:val="bullet"/>
+      <w:lvlText w:val=""/>
+      <w:lvlJc w:val="left"/>
+      <w:pPr>
+        <w:ind w:left="3960" w:hanging="360"/>
+      </w:pPr>
+      <w:rPr>
+        <w:rFonts w:ascii="Wingdings" w:hAnsi="Wingdings" w:hint="default"/>
+      </w:rPr>
+    </w:lvl>
+    <w:lvl w:ilvl="6" w:tplc="08070001" w:tentative="1">
+      <w:start w:val="1"/>
+      <w:numFmt w:val="bullet"/>
+      <w:lvlText w:val=""/>
+      <w:lvlJc w:val="left"/>
+      <w:pPr>
+        <w:ind w:left="4680" w:hanging="360"/>
+      </w:pPr>
+      <w:rPr>
+        <w:rFonts w:ascii="Symbol" w:hAnsi="Symbol" w:hint="default"/>
+      </w:rPr>
+    </w:lvl>
+    <w:lvl w:ilvl="7" w:tplc="08070003" w:tentative="1">
+      <w:start w:val="1"/>
+      <w:numFmt w:val="bullet"/>
+      <w:lvlText w:val="o"/>
+      <w:lvlJc w:val="left"/>
+      <w:pPr>
+        <w:ind w:left="5400" w:hanging="360"/>
+      </w:pPr>
+      <w:rPr>
+        <w:rFonts w:ascii="Courier New" w:hAnsi="Courier New" w:cs="Courier New" w:hint="default"/>
+      </w:rPr>
+    </w:lvl>
+    <w:lvl w:ilvl="8" w:tplc="08070005" w:tentative="1">
+      <w:start w:val="1"/>
+      <w:numFmt w:val="bullet"/>
+      <w:lvlText w:val=""/>
+      <w:lvlJc w:val="left"/>
+      <w:pPr>
+        <w:ind w:left="6120" w:hanging="360"/>
+      </w:pPr>
+      <w:rPr>
+        <w:rFonts w:ascii="Wingdings" w:hAnsi="Wingdings" w:hint="default"/>
+      </w:rPr>
+    </w:lvl>
+  </w:abstractNum>
+  <w:abstractNum w:abstractNumId="4" w15:restartNumberingAfterBreak="0">
+    <w:nsid w:val="37544772"/>
+    <w:multiLevelType w:val="hybridMultilevel"/>
+    <w:tmpl w:val="578C17F4"/>
+    <w:lvl w:ilvl="0" w:tplc="08070001">
+      <w:start w:val="1"/>
+      <w:numFmt w:val="bullet"/>
+      <w:lvlText w:val=""/>
+      <w:lvlJc w:val="left"/>
+      <w:pPr>
+        <w:ind w:left="360" w:hanging="360"/>
+      </w:pPr>
+      <w:rPr>
+        <w:rFonts w:ascii="Symbol" w:hAnsi="Symbol" w:hint="default"/>
+      </w:rPr>
+    </w:lvl>
+    <w:lvl w:ilvl="1" w:tplc="08070003" w:tentative="1">
+      <w:start w:val="1"/>
+      <w:numFmt w:val="bullet"/>
+      <w:lvlText w:val="o"/>
+      <w:lvlJc w:val="left"/>
+      <w:pPr>
+        <w:ind w:left="1080" w:hanging="360"/>
+      </w:pPr>
+      <w:rPr>
+        <w:rFonts w:ascii="Courier New" w:hAnsi="Courier New" w:cs="Courier New" w:hint="default"/>
+      </w:rPr>
+    </w:lvl>
+    <w:lvl w:ilvl="2" w:tplc="08070005" w:tentative="1">
+      <w:start w:val="1"/>
+      <w:numFmt w:val="bullet"/>
+      <w:lvlText w:val=""/>
+      <w:lvlJc w:val="left"/>
+      <w:pPr>
+        <w:ind w:left="1800" w:hanging="360"/>
+      </w:pPr>
+      <w:rPr>
+        <w:rFonts w:ascii="Wingdings" w:hAnsi="Wingdings" w:hint="default"/>
+      </w:rPr>
+    </w:lvl>
+    <w:lvl w:ilvl="3" w:tplc="08070001" w:tentative="1">
+      <w:start w:val="1"/>
+      <w:numFmt w:val="bullet"/>
+      <w:lvlText w:val=""/>
+      <w:lvlJc w:val="left"/>
+      <w:pPr>
+        <w:ind w:left="2520" w:hanging="360"/>
+      </w:pPr>
+      <w:rPr>
+        <w:rFonts w:ascii="Symbol" w:hAnsi="Symbol" w:hint="default"/>
+      </w:rPr>
+    </w:lvl>
+    <w:lvl w:ilvl="4" w:tplc="08070003" w:tentative="1">
+      <w:start w:val="1"/>
+      <w:numFmt w:val="bullet"/>
+      <w:lvlText w:val="o"/>
+      <w:lvlJc w:val="left"/>
+      <w:pPr>
+        <w:ind w:left="3240" w:hanging="360"/>
+      </w:pPr>
+      <w:rPr>
+        <w:rFonts w:ascii="Courier New" w:hAnsi="Courier New" w:cs="Courier New" w:hint="default"/>
+      </w:rPr>
+    </w:lvl>
+    <w:lvl w:ilvl="5" w:tplc="08070005" w:tentative="1">
+      <w:start w:val="1"/>
+      <w:numFmt w:val="bullet"/>
+      <w:lvlText w:val=""/>
+      <w:lvlJc w:val="left"/>
+      <w:pPr>
+        <w:ind w:left="3960" w:hanging="360"/>
+      </w:pPr>
+      <w:rPr>
+        <w:rFonts w:ascii="Wingdings" w:hAnsi="Wingdings" w:hint="default"/>
+      </w:rPr>
+    </w:lvl>
+    <w:lvl w:ilvl="6" w:tplc="08070001" w:tentative="1">
+      <w:start w:val="1"/>
+      <w:numFmt w:val="bullet"/>
+      <w:lvlText w:val=""/>
+      <w:lvlJc w:val="left"/>
+      <w:pPr>
+        <w:ind w:left="4680" w:hanging="360"/>
+      </w:pPr>
+      <w:rPr>
+        <w:rFonts w:ascii="Symbol" w:hAnsi="Symbol" w:hint="default"/>
+      </w:rPr>
+    </w:lvl>
+    <w:lvl w:ilvl="7" w:tplc="08070003" w:tentative="1">
+      <w:start w:val="1"/>
+      <w:numFmt w:val="bullet"/>
+      <w:lvlText w:val="o"/>
+      <w:lvlJc w:val="left"/>
+      <w:pPr>
+        <w:ind w:left="5400" w:hanging="360"/>
+      </w:pPr>
+      <w:rPr>
+        <w:rFonts w:ascii="Courier New" w:hAnsi="Courier New" w:cs="Courier New" w:hint="default"/>
+      </w:rPr>
+    </w:lvl>
+    <w:lvl w:ilvl="8" w:tplc="08070005" w:tentative="1">
+      <w:start w:val="1"/>
+      <w:numFmt w:val="bullet"/>
+      <w:lvlText w:val=""/>
+      <w:lvlJc w:val="left"/>
+      <w:pPr>
+        <w:ind w:left="6120" w:hanging="360"/>
+      </w:pPr>
+      <w:rPr>
+        <w:rFonts w:ascii="Wingdings" w:hAnsi="Wingdings" w:hint="default"/>
+      </w:rPr>
+    </w:lvl>
+  </w:abstractNum>
+  <w:abstractNum w:abstractNumId="5" w15:restartNumberingAfterBreak="0">
+    <w:nsid w:val="499F1691"/>
+    <w:multiLevelType w:val="hybridMultilevel"/>
+    <w:tmpl w:val="CBE6D530"/>
+    <w:lvl w:ilvl="0" w:tplc="08070001">
+      <w:start w:val="1"/>
+      <w:numFmt w:val="bullet"/>
+      <w:lvlText w:val=""/>
+      <w:lvlJc w:val="left"/>
+      <w:pPr>
+        <w:ind w:left="360" w:hanging="360"/>
+      </w:pPr>
+      <w:rPr>
+        <w:rFonts w:ascii="Symbol" w:hAnsi="Symbol" w:hint="default"/>
+      </w:rPr>
+    </w:lvl>
+    <w:lvl w:ilvl="1" w:tplc="08070003" w:tentative="1">
+      <w:start w:val="1"/>
+      <w:numFmt w:val="bullet"/>
+      <w:lvlText w:val="o"/>
+      <w:lvlJc w:val="left"/>
+      <w:pPr>
+        <w:ind w:left="1080" w:hanging="360"/>
+      </w:pPr>
+      <w:rPr>
+        <w:rFonts w:ascii="Courier New" w:hAnsi="Courier New" w:cs="Courier New" w:hint="default"/>
+      </w:rPr>
+    </w:lvl>
+    <w:lvl w:ilvl="2" w:tplc="08070005" w:tentative="1">
+      <w:start w:val="1"/>
+      <w:numFmt w:val="bullet"/>
+      <w:lvlText w:val=""/>
+      <w:lvlJc w:val="left"/>
+      <w:pPr>
+        <w:ind w:left="1800" w:hanging="360"/>
+      </w:pPr>
+      <w:rPr>
+        <w:rFonts w:ascii="Wingdings" w:hAnsi="Wingdings" w:hint="default"/>
+      </w:rPr>
+    </w:lvl>
+    <w:lvl w:ilvl="3" w:tplc="08070001" w:tentative="1">
+      <w:start w:val="1"/>
+      <w:numFmt w:val="bullet"/>
+      <w:lvlText w:val=""/>
+      <w:lvlJc w:val="left"/>
+      <w:pPr>
+        <w:ind w:left="2520" w:hanging="360"/>
+      </w:pPr>
+      <w:rPr>
+        <w:rFonts w:ascii="Symbol" w:hAnsi="Symbol" w:hint="default"/>
+      </w:rPr>
+    </w:lvl>
+    <w:lvl w:ilvl="4" w:tplc="08070003" w:tentative="1">
+      <w:start w:val="1"/>
+      <w:numFmt w:val="bullet"/>
+      <w:lvlText w:val="o"/>
+      <w:lvlJc w:val="left"/>
+      <w:pPr>
+        <w:ind w:left="3240" w:hanging="360"/>
+      </w:pPr>
+      <w:rPr>
+        <w:rFonts w:ascii="Courier New" w:hAnsi="Courier New" w:cs="Courier New" w:hint="default"/>
+      </w:rPr>
+    </w:lvl>
+    <w:lvl w:ilvl="5" w:tplc="08070005" w:tentative="1">
+      <w:start w:val="1"/>
+      <w:numFmt w:val="bullet"/>
+      <w:lvlText w:val=""/>
+      <w:lvlJc w:val="left"/>
+      <w:pPr>
+        <w:ind w:left="3960" w:hanging="360"/>
+      </w:pPr>
+      <w:rPr>
+        <w:rFonts w:ascii="Wingdings" w:hAnsi="Wingdings" w:hint="default"/>
+      </w:rPr>
+    </w:lvl>
+    <w:lvl w:ilvl="6" w:tplc="08070001" w:tentative="1">
+      <w:start w:val="1"/>
+      <w:numFmt w:val="bullet"/>
+      <w:lvlText w:val=""/>
+      <w:lvlJc w:val="left"/>
+      <w:pPr>
+        <w:ind w:left="4680" w:hanging="360"/>
+      </w:pPr>
+      <w:rPr>
+        <w:rFonts w:ascii="Symbol" w:hAnsi="Symbol" w:hint="default"/>
+      </w:rPr>
+    </w:lvl>
+    <w:lvl w:ilvl="7" w:tplc="08070003" w:tentative="1">
+      <w:start w:val="1"/>
+      <w:numFmt w:val="bullet"/>
+      <w:lvlText w:val="o"/>
+      <w:lvlJc w:val="left"/>
+      <w:pPr>
+        <w:ind w:left="5400" w:hanging="360"/>
+      </w:pPr>
+      <w:rPr>
+        <w:rFonts w:ascii="Courier New" w:hAnsi="Courier New" w:cs="Courier New" w:hint="default"/>
+      </w:rPr>
+    </w:lvl>
+    <w:lvl w:ilvl="8" w:tplc="08070005" w:tentative="1">
+      <w:start w:val="1"/>
+      <w:numFmt w:val="bullet"/>
+      <w:lvlText w:val=""/>
+      <w:lvlJc w:val="left"/>
+      <w:pPr>
+        <w:ind w:left="6120" w:hanging="360"/>
+      </w:pPr>
+      <w:rPr>
+        <w:rFonts w:ascii="Wingdings" w:hAnsi="Wingdings" w:hint="default"/>
+      </w:rPr>
+    </w:lvl>
+  </w:abstractNum>
+  <w:abstractNum w:abstractNumId="6" w15:restartNumberingAfterBreak="0">
+    <w:nsid w:val="57BE68FD"/>
+    <w:multiLevelType w:val="hybridMultilevel"/>
+    <w:tmpl w:val="F05EF40A"/>
+    <w:lvl w:ilvl="0" w:tplc="08070001">
+      <w:start w:val="1"/>
+      <w:numFmt w:val="bullet"/>
+      <w:lvlText w:val=""/>
+      <w:lvlJc w:val="left"/>
+      <w:pPr>
+        <w:ind w:left="360" w:hanging="360"/>
+      </w:pPr>
+      <w:rPr>
+        <w:rFonts w:ascii="Symbol" w:hAnsi="Symbol" w:hint="default"/>
+      </w:rPr>
+    </w:lvl>
+    <w:lvl w:ilvl="1" w:tplc="08070003" w:tentative="1">
+      <w:start w:val="1"/>
+      <w:numFmt w:val="bullet"/>
+      <w:lvlText w:val="o"/>
+      <w:lvlJc w:val="left"/>
+      <w:pPr>
+        <w:ind w:left="1080" w:hanging="360"/>
+      </w:pPr>
+      <w:rPr>
+        <w:rFonts w:ascii="Courier New" w:hAnsi="Courier New" w:cs="Courier New" w:hint="default"/>
+      </w:rPr>
+    </w:lvl>
+    <w:lvl w:ilvl="2" w:tplc="08070005" w:tentative="1">
+      <w:start w:val="1"/>
+      <w:numFmt w:val="bullet"/>
+      <w:lvlText w:val=""/>
+      <w:lvlJc w:val="left"/>
+      <w:pPr>
+        <w:ind w:left="1800" w:hanging="360"/>
+      </w:pPr>
+      <w:rPr>
+        <w:rFonts w:ascii="Wingdings" w:hAnsi="Wingdings" w:hint="default"/>
+      </w:rPr>
+    </w:lvl>
+    <w:lvl w:ilvl="3" w:tplc="08070001" w:tentative="1">
+      <w:start w:val="1"/>
+      <w:numFmt w:val="bullet"/>
+      <w:lvlText w:val=""/>
+      <w:lvlJc w:val="left"/>
+      <w:pPr>
+        <w:ind w:left="2520" w:hanging="360"/>
+      </w:pPr>
+      <w:rPr>
+        <w:rFonts w:ascii="Symbol" w:hAnsi="Symbol" w:hint="default"/>
+      </w:rPr>
+    </w:lvl>
+    <w:lvl w:ilvl="4" w:tplc="08070003" w:tentative="1">
+      <w:start w:val="1"/>
+      <w:numFmt w:val="bullet"/>
+      <w:lvlText w:val="o"/>
+      <w:lvlJc w:val="left"/>
+      <w:pPr>
+        <w:ind w:left="3240" w:hanging="360"/>
+      </w:pPr>
+      <w:rPr>
+        <w:rFonts w:ascii="Courier New" w:hAnsi="Courier New" w:cs="Courier New" w:hint="default"/>
+      </w:rPr>
+    </w:lvl>
+    <w:lvl w:ilvl="5" w:tplc="08070005" w:tentative="1">
+      <w:start w:val="1"/>
+      <w:numFmt w:val="bullet"/>
+      <w:lvlText w:val=""/>
+      <w:lvlJc w:val="left"/>
+      <w:pPr>
+        <w:ind w:left="3960" w:hanging="360"/>
+      </w:pPr>
+      <w:rPr>
+        <w:rFonts w:ascii="Wingdings" w:hAnsi="Wingdings" w:hint="default"/>
+      </w:rPr>
+    </w:lvl>
+    <w:lvl w:ilvl="6" w:tplc="08070001" w:tentative="1">
+      <w:start w:val="1"/>
+      <w:numFmt w:val="bullet"/>
+      <w:lvlText w:val=""/>
+      <w:lvlJc w:val="left"/>
+      <w:pPr>
+        <w:ind w:left="4680" w:hanging="360"/>
+      </w:pPr>
+      <w:rPr>
+        <w:rFonts w:ascii="Symbol" w:hAnsi="Symbol" w:hint="default"/>
+      </w:rPr>
+    </w:lvl>
+    <w:lvl w:ilvl="7" w:tplc="08070003" w:tentative="1">
+      <w:start w:val="1"/>
+      <w:numFmt w:val="bullet"/>
+      <w:lvlText w:val="o"/>
+      <w:lvlJc w:val="left"/>
+      <w:pPr>
+        <w:ind w:left="5400" w:hanging="360"/>
+      </w:pPr>
+      <w:rPr>
+        <w:rFonts w:ascii="Courier New" w:hAnsi="Courier New" w:cs="Courier New" w:hint="default"/>
+      </w:rPr>
+    </w:lvl>
+    <w:lvl w:ilvl="8" w:tplc="08070005" w:tentative="1">
+      <w:start w:val="1"/>
+      <w:numFmt w:val="bullet"/>
+      <w:lvlText w:val=""/>
+      <w:lvlJc w:val="left"/>
+      <w:pPr>
+        <w:ind w:left="6120" w:hanging="360"/>
+      </w:pPr>
+      <w:rPr>
+        <w:rFonts w:ascii="Wingdings" w:hAnsi="Wingdings" w:hint="default"/>
+      </w:rPr>
+    </w:lvl>
+  </w:abstractNum>
+  <w:abstractNum w:abstractNumId="7" w15:restartNumberingAfterBreak="0">
+    <w:nsid w:val="5DD04888"/>
+    <w:multiLevelType w:val="hybridMultilevel"/>
+    <w:tmpl w:val="9326A288"/>
+    <w:lvl w:ilvl="0" w:tplc="08070001">
+      <w:start w:val="1"/>
+      <w:numFmt w:val="bullet"/>
+      <w:lvlText w:val=""/>
+      <w:lvlJc w:val="left"/>
+      <w:pPr>
+        <w:ind w:left="360" w:hanging="360"/>
+      </w:pPr>
+      <w:rPr>
+        <w:rFonts w:ascii="Symbol" w:hAnsi="Symbol" w:hint="default"/>
+      </w:rPr>
+    </w:lvl>
+    <w:lvl w:ilvl="1" w:tplc="08070003" w:tentative="1">
+      <w:start w:val="1"/>
+      <w:numFmt w:val="bullet"/>
+      <w:lvlText w:val="o"/>
+      <w:lvlJc w:val="left"/>
+      <w:pPr>
+        <w:ind w:left="1080" w:hanging="360"/>
+      </w:pPr>
+      <w:rPr>
+        <w:rFonts w:ascii="Courier New" w:hAnsi="Courier New" w:cs="Courier New" w:hint="default"/>
+      </w:rPr>
+    </w:lvl>
+    <w:lvl w:ilvl="2" w:tplc="08070005" w:tentative="1">
+      <w:start w:val="1"/>
+      <w:numFmt w:val="bullet"/>
+      <w:lvlText w:val=""/>
+      <w:lvlJc w:val="left"/>
+      <w:pPr>
+        <w:ind w:left="1800" w:hanging="360"/>
+      </w:pPr>
+      <w:rPr>
+        <w:rFonts w:ascii="Wingdings" w:hAnsi="Wingdings" w:hint="default"/>
+      </w:rPr>
+    </w:lvl>
+    <w:lvl w:ilvl="3" w:tplc="08070001" w:tentative="1">
+      <w:start w:val="1"/>
+      <w:numFmt w:val="bullet"/>
+      <w:lvlText w:val=""/>
+      <w:lvlJc w:val="left"/>
+      <w:pPr>
+        <w:ind w:left="2520" w:hanging="360"/>
+      </w:pPr>
+      <w:rPr>
+        <w:rFonts w:ascii="Symbol" w:hAnsi="Symbol" w:hint="default"/>
+      </w:rPr>
+    </w:lvl>
+    <w:lvl w:ilvl="4" w:tplc="08070003" w:tentative="1">
+      <w:start w:val="1"/>
+      <w:numFmt w:val="bullet"/>
+      <w:lvlText w:val="o"/>
+      <w:lvlJc w:val="left"/>
+      <w:pPr>
+        <w:ind w:left="3240" w:hanging="360"/>
+      </w:pPr>
+      <w:rPr>
+        <w:rFonts w:ascii="Courier New" w:hAnsi="Courier New" w:cs="Courier New" w:hint="default"/>
+      </w:rPr>
+    </w:lvl>
+    <w:lvl w:ilvl="5" w:tplc="08070005" w:tentative="1">
+      <w:start w:val="1"/>
+      <w:numFmt w:val="bullet"/>
+      <w:lvlText w:val=""/>
+      <w:lvlJc w:val="left"/>
+      <w:pPr>
+        <w:ind w:left="3960" w:hanging="360"/>
+      </w:pPr>
+      <w:rPr>
+        <w:rFonts w:ascii="Wingdings" w:hAnsi="Wingdings" w:hint="default"/>
+      </w:rPr>
+    </w:lvl>
+    <w:lvl w:ilvl="6" w:tplc="08070001" w:tentative="1">
+      <w:start w:val="1"/>
+      <w:numFmt w:val="bullet"/>
+      <w:lvlText w:val=""/>
+      <w:lvlJc w:val="left"/>
+      <w:pPr>
+        <w:ind w:left="4680" w:hanging="360"/>
+      </w:pPr>
+      <w:rPr>
+        <w:rFonts w:ascii="Symbol" w:hAnsi="Symbol" w:hint="default"/>
+      </w:rPr>
+    </w:lvl>
+    <w:lvl w:ilvl="7" w:tplc="08070003" w:tentative="1">
+      <w:start w:val="1"/>
+      <w:numFmt w:val="bullet"/>
+      <w:lvlText w:val="o"/>
+      <w:lvlJc w:val="left"/>
+      <w:pPr>
+        <w:ind w:left="5400" w:hanging="360"/>
+      </w:pPr>
+      <w:rPr>
+        <w:rFonts w:ascii="Courier New" w:hAnsi="Courier New" w:cs="Courier New" w:hint="default"/>
+      </w:rPr>
+    </w:lvl>
+    <w:lvl w:ilvl="8" w:tplc="08070005" w:tentative="1">
+      <w:start w:val="1"/>
+      <w:numFmt w:val="bullet"/>
+      <w:lvlText w:val=""/>
+      <w:lvlJc w:val="left"/>
+      <w:pPr>
+        <w:ind w:left="6120" w:hanging="360"/>
+      </w:pPr>
+      <w:rPr>
+        <w:rFonts w:ascii="Wingdings" w:hAnsi="Wingdings" w:hint="default"/>
+      </w:rPr>
+    </w:lvl>
+  </w:abstractNum>
+  <w:abstractNum w:abstractNumId="8" w15:restartNumberingAfterBreak="0">
+    <w:nsid w:val="68F370E1"/>
+    <w:multiLevelType w:val="hybridMultilevel"/>
+    <w:tmpl w:val="6EA05398"/>
+    <w:lvl w:ilvl="0" w:tplc="08070001">
+      <w:start w:val="1"/>
+      <w:numFmt w:val="bullet"/>
+      <w:lvlText w:val=""/>
+      <w:lvlJc w:val="left"/>
+      <w:pPr>
+        <w:ind w:left="360" w:hanging="360"/>
+      </w:pPr>
+      <w:rPr>
+        <w:rFonts w:ascii="Symbol" w:hAnsi="Symbol" w:hint="default"/>
+      </w:rPr>
+    </w:lvl>
+    <w:lvl w:ilvl="1" w:tplc="08070003" w:tentative="1">
+      <w:start w:val="1"/>
+      <w:numFmt w:val="bullet"/>
+      <w:lvlText w:val="o"/>
+      <w:lvlJc w:val="left"/>
+      <w:pPr>
+        <w:ind w:left="1080" w:hanging="360"/>
+      </w:pPr>
+      <w:rPr>
+        <w:rFonts w:ascii="Courier New" w:hAnsi="Courier New" w:cs="Courier New" w:hint="default"/>
+      </w:rPr>
+    </w:lvl>
+    <w:lvl w:ilvl="2" w:tplc="08070005" w:tentative="1">
+      <w:start w:val="1"/>
+      <w:numFmt w:val="bullet"/>
+      <w:lvlText w:val=""/>
+      <w:lvlJc w:val="left"/>
+      <w:pPr>
+        <w:ind w:left="1800" w:hanging="360"/>
+      </w:pPr>
+      <w:rPr>
+        <w:rFonts w:ascii="Wingdings" w:hAnsi="Wingdings" w:hint="default"/>
+      </w:rPr>
+    </w:lvl>
+    <w:lvl w:ilvl="3" w:tplc="08070001" w:tentative="1">
+      <w:start w:val="1"/>
+      <w:numFmt w:val="bullet"/>
+      <w:lvlText w:val=""/>
+      <w:lvlJc w:val="left"/>
+      <w:pPr>
+        <w:ind w:left="2520" w:hanging="360"/>
+      </w:pPr>
+      <w:rPr>
+        <w:rFonts w:ascii="Symbol" w:hAnsi="Symbol" w:hint="default"/>
+      </w:rPr>
+    </w:lvl>
+    <w:lvl w:ilvl="4" w:tplc="08070003" w:tentative="1">
+      <w:start w:val="1"/>
+      <w:numFmt w:val="bullet"/>
+      <w:lvlText w:val="o"/>
+      <w:lvlJc w:val="left"/>
+      <w:pPr>
+        <w:ind w:left="3240" w:hanging="360"/>
+      </w:pPr>
+      <w:rPr>
+        <w:rFonts w:ascii="Courier New" w:hAnsi="Courier New" w:cs="Courier New" w:hint="default"/>
+      </w:rPr>
+    </w:lvl>
+    <w:lvl w:ilvl="5" w:tplc="08070005" w:tentative="1">
+      <w:start w:val="1"/>
+      <w:numFmt w:val="bullet"/>
+      <w:lvlText w:val=""/>
+      <w:lvlJc w:val="left"/>
+      <w:pPr>
+        <w:ind w:left="3960" w:hanging="360"/>
+      </w:pPr>
+      <w:rPr>
+        <w:rFonts w:ascii="Wingdings" w:hAnsi="Wingdings" w:hint="default"/>
+      </w:rPr>
+    </w:lvl>
+    <w:lvl w:ilvl="6" w:tplc="08070001" w:tentative="1">
+      <w:start w:val="1"/>
+      <w:numFmt w:val="bullet"/>
+      <w:lvlText w:val=""/>
+      <w:lvlJc w:val="left"/>
+      <w:pPr>
+        <w:ind w:left="4680" w:hanging="360"/>
+      </w:pPr>
+      <w:rPr>
+        <w:rFonts w:ascii="Symbol" w:hAnsi="Symbol" w:hint="default"/>
+      </w:rPr>
+    </w:lvl>
+    <w:lvl w:ilvl="7" w:tplc="08070003" w:tentative="1">
+      <w:start w:val="1"/>
+      <w:numFmt w:val="bullet"/>
+      <w:lvlText w:val="o"/>
+      <w:lvlJc w:val="left"/>
+      <w:pPr>
+        <w:ind w:left="5400" w:hanging="360"/>
+      </w:pPr>
+      <w:rPr>
+        <w:rFonts w:ascii="Courier New" w:hAnsi="Courier New" w:cs="Courier New" w:hint="default"/>
+      </w:rPr>
+    </w:lvl>
+    <w:lvl w:ilvl="8" w:tplc="08070005" w:tentative="1">
+      <w:start w:val="1"/>
+      <w:numFmt w:val="bullet"/>
+      <w:lvlText w:val=""/>
+      <w:lvlJc w:val="left"/>
+      <w:pPr>
+        <w:ind w:left="6120" w:hanging="360"/>
+      </w:pPr>
+      <w:rPr>
+        <w:rFonts w:ascii="Wingdings" w:hAnsi="Wingdings" w:hint="default"/>
+      </w:rPr>
+    </w:lvl>
+  </w:abstractNum>
+  <w:abstractNum w:abstractNumId="9" w15:restartNumberingAfterBreak="0">
     <w:nsid w:val="6F0C7A55"/>
     <w:multiLevelType w:val="multilevel"/>
     <w:tmpl w:val="08070025"/>
@@ -30926,10 +32372,34 @@
     </w:lvl>
   </w:abstractNum>
   <w:num w:numId="1" w16cid:durableId="1908564113">
+    <w:abstractNumId w:val="9"/>
+  </w:num>
+  <w:num w:numId="2" w16cid:durableId="740298186">
+    <w:abstractNumId w:val="2"/>
+  </w:num>
+  <w:num w:numId="3" w16cid:durableId="389309420">
+    <w:abstractNumId w:val="0"/>
+  </w:num>
+  <w:num w:numId="4" w16cid:durableId="129835100">
     <w:abstractNumId w:val="1"/>
   </w:num>
-  <w:num w:numId="2" w16cid:durableId="740298186">
-    <w:abstractNumId w:val="0"/>
+  <w:num w:numId="5" w16cid:durableId="155073772">
+    <w:abstractNumId w:val="6"/>
+  </w:num>
+  <w:num w:numId="6" w16cid:durableId="1047218836">
+    <w:abstractNumId w:val="5"/>
+  </w:num>
+  <w:num w:numId="7" w16cid:durableId="2055884068">
+    <w:abstractNumId w:val="3"/>
+  </w:num>
+  <w:num w:numId="8" w16cid:durableId="2050910630">
+    <w:abstractNumId w:val="7"/>
+  </w:num>
+  <w:num w:numId="9" w16cid:durableId="1909264048">
+    <w:abstractNumId w:val="4"/>
+  </w:num>
+  <w:num w:numId="10" w16cid:durableId="1960183426">
+    <w:abstractNumId w:val="8"/>
   </w:num>
 </w:numbering>
 </file>
@@ -31820,10 +33290,9 @@
     <w:basedOn w:val="Standard"/>
     <w:uiPriority w:val="34"/>
     <w:qFormat/>
-    <w:rsid w:val="001808F1"/>
+    <w:rsid w:val="008868A9"/>
     <w:pPr>
       <w:ind w:left="720"/>
-      <w:contextualSpacing/>
     </w:pPr>
   </w:style>
   <w:style w:type="character" w:styleId="IntensiveHervorhebung">
@@ -31905,6 +33374,72 @@
         <w:insideV w:val="single" w:sz="4" w:space="0" w:color="auto"/>
       </w:tblBorders>
     </w:tblPr>
+  </w:style>
+  <w:style w:type="paragraph" w:styleId="Kopfzeile">
+    <w:name w:val="header"/>
+    <w:basedOn w:val="Standard"/>
+    <w:link w:val="KopfzeileZchn"/>
+    <w:uiPriority w:val="99"/>
+    <w:unhideWhenUsed/>
+    <w:rsid w:val="0021168C"/>
+    <w:pPr>
+      <w:tabs>
+        <w:tab w:val="center" w:pos="4536"/>
+        <w:tab w:val="right" w:pos="9072"/>
+      </w:tabs>
+      <w:spacing w:after="0" w:line="240" w:lineRule="auto"/>
+    </w:pPr>
+  </w:style>
+  <w:style w:type="character" w:customStyle="1" w:styleId="KopfzeileZchn">
+    <w:name w:val="Kopfzeile Zchn"/>
+    <w:basedOn w:val="Absatz-Standardschriftart"/>
+    <w:link w:val="Kopfzeile"/>
+    <w:uiPriority w:val="99"/>
+    <w:rsid w:val="0021168C"/>
+  </w:style>
+  <w:style w:type="paragraph" w:styleId="Fuzeile">
+    <w:name w:val="footer"/>
+    <w:basedOn w:val="Standard"/>
+    <w:link w:val="FuzeileZchn"/>
+    <w:uiPriority w:val="99"/>
+    <w:unhideWhenUsed/>
+    <w:rsid w:val="0021168C"/>
+    <w:pPr>
+      <w:tabs>
+        <w:tab w:val="center" w:pos="4536"/>
+        <w:tab w:val="right" w:pos="9072"/>
+      </w:tabs>
+      <w:spacing w:after="0" w:line="240" w:lineRule="auto"/>
+    </w:pPr>
+  </w:style>
+  <w:style w:type="character" w:customStyle="1" w:styleId="FuzeileZchn">
+    <w:name w:val="Fußzeile Zchn"/>
+    <w:basedOn w:val="Absatz-Standardschriftart"/>
+    <w:link w:val="Fuzeile"/>
+    <w:uiPriority w:val="99"/>
+    <w:rsid w:val="0021168C"/>
+  </w:style>
+  <w:style w:type="character" w:styleId="Fett">
+    <w:name w:val="Strong"/>
+    <w:basedOn w:val="Absatz-Standardschriftart"/>
+    <w:uiPriority w:val="22"/>
+    <w:qFormat/>
+    <w:rsid w:val="000A2FD3"/>
+    <w:rPr>
+      <w:b/>
+      <w:bCs/>
+      <w:color w:val="0E2841" w:themeColor="text2"/>
+    </w:rPr>
+  </w:style>
+  <w:style w:type="character" w:styleId="Platzhaltertext">
+    <w:name w:val="Placeholder Text"/>
+    <w:basedOn w:val="Absatz-Standardschriftart"/>
+    <w:uiPriority w:val="99"/>
+    <w:semiHidden/>
+    <w:rsid w:val="001134CB"/>
+    <w:rPr>
+      <w:color w:val="666666"/>
+    </w:rPr>
   </w:style>
 </w:styles>
 </file>

</xml_diff>

<commit_message>
docs/scripts: continue working on protocol reconstructions; make some tests with spectrometer and start to build actual protocol
</commit_message>
<xml_diff>
--- a/docs/protocol/reconstruction/Protokollrekonstruktion.docx
+++ b/docs/protocol/reconstruction/Protokollrekonstruktion.docx
@@ -3852,6 +3852,26 @@
         <w:tc>
           <w:tcPr>
             <w:tcW w:w="480" w:type="dxa"/>
+          </w:tcPr>
+          <w:p>
+            <w:r>
+              <w:t>c7</w:t>
+            </w:r>
+          </w:p>
+        </w:tc>
+        <w:tc>
+          <w:tcPr>
+            <w:tcW w:w="481" w:type="dxa"/>
+          </w:tcPr>
+          <w:p>
+            <w:r>
+              <w:t>4d</w:t>
+            </w:r>
+          </w:p>
+        </w:tc>
+        <w:tc>
+          <w:tcPr>
+            <w:tcW w:w="481" w:type="dxa"/>
             <w:shd w:val="clear" w:color="auto" w:fill="0C3512" w:themeFill="accent3" w:themeFillShade="80"/>
           </w:tcPr>
           <w:p>
@@ -3868,26 +3888,6 @@
           <w:p>
             <w:r>
               <w:t>00</w:t>
-            </w:r>
-          </w:p>
-        </w:tc>
-        <w:tc>
-          <w:tcPr>
-            <w:tcW w:w="481" w:type="dxa"/>
-          </w:tcPr>
-          <w:p>
-            <w:r>
-              <w:t>b1</w:t>
-            </w:r>
-          </w:p>
-        </w:tc>
-        <w:tc>
-          <w:tcPr>
-            <w:tcW w:w="481" w:type="dxa"/>
-          </w:tcPr>
-          <w:p>
-            <w:r>
-              <w:t>76</w:t>
             </w:r>
           </w:p>
         </w:tc>
@@ -4291,7 +4291,19 @@
         <w:t>s</w:t>
       </w:r>
       <w:r>
-        <w:t xml:space="preserve"> Nr. 36 und 37 ändern sich nicht, solange das Gerät nicht neu verbunden wird, die Werte werden in keine anderen Pakete kopiert.</w:t>
+        <w:t xml:space="preserve"> Nr. 3</w:t>
+      </w:r>
+      <w:r>
+        <w:t>8</w:t>
+      </w:r>
+      <w:r>
+        <w:t xml:space="preserve"> und 3</w:t>
+      </w:r>
+      <w:r>
+        <w:t>9</w:t>
+      </w:r>
+      <w:r>
+        <w:t xml:space="preserve"> ändern sich nicht, solange das Gerät nicht neu verbunden wird, die Werte werden in keine anderen Pakete kopiert.</w:t>
       </w:r>
     </w:p>
     <w:p>
@@ -31009,6 +31021,9 @@
     <w:p>
       <w:r>
         <w:t>Alle verbindungsspezifischen Bytes können genullt werden, das Gerät akzeptiert die Sequenz weiterhin.</w:t>
+      </w:r>
+      <w:r>
+        <w:t xml:space="preserve"> Alle sessionspezifischen Bytes können ebenfalls genullt werden, das Gerät akzeptiert weiterhin reproduzierbar sämtliche Anfragen.</w:t>
       </w:r>
     </w:p>
     <w:p>

</xml_diff>